<commit_message>
feat: harden campus ledger production project
</commit_message>
<xml_diff>
--- a/星芒账本_开发总结.docx
+++ b/星芒账本_开发总结.docx
@@ -2,7 +2,6 @@
 <file path=word/document.xml><?xml version="1.0" encoding="utf-8"?>
 <w:document xmlns:wpc="http://schemas.microsoft.com/office/word/2010/wordprocessingCanvas" xmlns:mo="http://schemas.microsoft.com/office/mac/office/2008/main" xmlns:mc="http://schemas.openxmlformats.org/markup-compatibility/2006" xmlns:mv="urn:schemas-microsoft-com:mac:vml" xmlns:o="urn:schemas-microsoft-com:office:office" xmlns:r="http://schemas.openxmlformats.org/officeDocument/2006/relationships" xmlns:m="http://schemas.openxmlformats.org/officeDocument/2006/math" xmlns:v="urn:schemas-microsoft-com:vml" xmlns:wp14="http://schemas.microsoft.com/office/word/2010/wordprocessingDrawing" xmlns:wp="http://schemas.openxmlformats.org/drawingml/2006/wordprocessingDrawing" xmlns:w10="urn:schemas-microsoft-com:office:word" xmlns:w="http://schemas.openxmlformats.org/wordprocessingml/2006/main" xmlns:w14="http://schemas.microsoft.com/office/word/2010/wordml" xmlns:wpg="http://schemas.microsoft.com/office/word/2010/wordprocessingGroup" xmlns:wpi="http://schemas.microsoft.com/office/word/2010/wordprocessingInk" xmlns:wne="http://schemas.microsoft.com/office/word/2006/wordml" xmlns:wps="http://schemas.microsoft.com/office/word/2010/wordprocessingShape" mc:Ignorable="w14 wp14">
   <w:body>
-    <w:p/>
     <w:p/>
     <w:p>
       <w:pPr>
@@ -12,10 +11,10 @@
         <w:rPr>
           <w:rFonts w:ascii="Microsoft YaHei" w:hAnsi="Microsoft YaHei" w:eastAsia="Microsoft YaHei"/>
           <w:b/>
-          <w:color w:val="1D4ED8"/>
-          <w:sz w:val="28"/>
+          <w:color w:val="172033"/>
+          <w:sz w:val="54"/>
         </w:rPr>
-        <w:t>星芒账本</w:t>
+        <w:t>星芒账本开发总结（功能补全版）</w:t>
       </w:r>
     </w:p>
     <w:p>
@@ -25,32 +24,19 @@
       <w:r>
         <w:rPr>
           <w:rFonts w:ascii="Microsoft YaHei" w:hAnsi="Microsoft YaHei" w:eastAsia="Microsoft YaHei"/>
-          <w:b/>
-          <w:color w:val="172033"/>
-          <w:sz w:val="60"/>
+          <w:b w:val="0"/>
+          <w:color w:val="637083"/>
+          <w:sz w:val="24"/>
         </w:rPr>
-        <w:t>星芒账本开发总结</w:t>
-      </w:r>
-    </w:p>
-    <w:p>
-      <w:pPr>
-        <w:jc w:val="center"/>
-      </w:pPr>
-      <w:r>
-        <w:rPr>
-          <w:rFonts w:ascii="Microsoft YaHei" w:hAnsi="Microsoft YaHei" w:eastAsia="Microsoft YaHei"/>
-          <w:color w:val="637083"/>
-          <w:sz w:val="26"/>
-        </w:rPr>
-        <w:t>创意型大学生生活记账本 · 课程设计开发复盘</w:t>
+        <w:t>课程设计开发复盘 · 前后端功能已补齐</w:t>
       </w:r>
     </w:p>
     <w:p/>
     <w:tbl>
       <w:tblPr>
+        <w:tblStyle w:val="TableGrid"/>
         <w:tblW w:type="auto" w:w="0"/>
         <w:jc w:val="center"/>
-        <w:tblLayout w:type="fixed"/>
         <w:tblLook w:firstColumn="1" w:firstRow="1" w:lastColumn="0" w:lastRow="0" w:noHBand="0" w:noVBand="1" w:val="04A0"/>
         <w:tblBorders>
           <w:top w:val="single" w:sz="6" w:space="0" w:color="D9E1EC"/>
@@ -62,8 +48,8 @@
         </w:tblBorders>
       </w:tblPr>
       <w:tblGrid>
-        <w:gridCol w:w="2088"/>
-        <w:gridCol w:w="6840"/>
+        <w:gridCol w:w="5026"/>
+        <w:gridCol w:w="5026"/>
       </w:tblGrid>
       <w:tr>
         <w:trPr>
@@ -71,19 +57,14 @@
         </w:trPr>
         <w:tc>
           <w:tcPr>
-            <w:tcW w:type="dxa" w:w="4997"/>
-            <w:tcMar>
-              <w:top w:w="150" w:type="dxa"/>
-              <w:start w:w="160" w:type="dxa"/>
-              <w:bottom w:w="150" w:type="dxa"/>
-              <w:end w:w="160" w:type="dxa"/>
-            </w:tcMar>
+            <w:tcW w:type="dxa" w:w="1944"/>
             <w:shd w:fill="EAF1FF"/>
             <w:vAlign w:val="center"/>
           </w:tcPr>
           <w:p>
             <w:pPr>
-              <w:spacing w:after="0" w:line="276" w:lineRule="auto"/>
+              <w:spacing w:after="0" w:line="269" w:lineRule="auto"/>
+              <w:jc w:val="center"/>
             </w:pPr>
             <w:r/>
             <w:r>
@@ -91,7 +72,53 @@
                 <w:rFonts w:ascii="Microsoft YaHei" w:hAnsi="Microsoft YaHei" w:eastAsia="Microsoft YaHei"/>
                 <w:b/>
                 <w:color w:val="1D4ED8"/>
-                <w:sz w:val="20"/>
+                <w:sz w:val="17"/>
+              </w:rPr>
+              <w:t>项目项</w:t>
+            </w:r>
+          </w:p>
+        </w:tc>
+        <w:tc>
+          <w:tcPr>
+            <w:tcW w:type="dxa" w:w="7488"/>
+            <w:shd w:fill="EAF1FF"/>
+            <w:vAlign w:val="center"/>
+          </w:tcPr>
+          <w:p>
+            <w:pPr>
+              <w:spacing w:after="0" w:line="269" w:lineRule="auto"/>
+              <w:jc w:val="center"/>
+            </w:pPr>
+            <w:r/>
+            <w:r>
+              <w:rPr>
+                <w:rFonts w:ascii="Microsoft YaHei" w:hAnsi="Microsoft YaHei" w:eastAsia="Microsoft YaHei"/>
+                <w:b/>
+                <w:color w:val="1D4ED8"/>
+                <w:sz w:val="17"/>
+              </w:rPr>
+              <w:t>内容</w:t>
+            </w:r>
+          </w:p>
+        </w:tc>
+      </w:tr>
+      <w:tr>
+        <w:tc>
+          <w:tcPr>
+            <w:tcW w:type="dxa" w:w="1944"/>
+            <w:vAlign w:val="center"/>
+          </w:tcPr>
+          <w:p>
+            <w:pPr>
+              <w:spacing w:after="0" w:line="269" w:lineRule="auto"/>
+            </w:pPr>
+            <w:r/>
+            <w:r>
+              <w:rPr>
+                <w:rFonts w:ascii="Microsoft YaHei" w:hAnsi="Microsoft YaHei" w:eastAsia="Microsoft YaHei"/>
+                <w:b w:val="0"/>
+                <w:color w:val="172033"/>
+                <w:sz w:val="17"/>
               </w:rPr>
               <w:t>项目名称</w:t>
             </w:r>
@@ -99,25 +126,20 @@
         </w:tc>
         <w:tc>
           <w:tcPr>
-            <w:tcW w:type="dxa" w:w="4997"/>
-            <w:tcMar>
-              <w:top w:w="150" w:type="dxa"/>
-              <w:start w:w="160" w:type="dxa"/>
-              <w:bottom w:w="150" w:type="dxa"/>
-              <w:end w:w="160" w:type="dxa"/>
-            </w:tcMar>
+            <w:tcW w:type="dxa" w:w="7488"/>
             <w:vAlign w:val="center"/>
           </w:tcPr>
           <w:p>
             <w:pPr>
-              <w:spacing w:after="0" w:line="276" w:lineRule="auto"/>
+              <w:spacing w:after="0" w:line="269" w:lineRule="auto"/>
             </w:pPr>
             <w:r/>
             <w:r>
               <w:rPr>
                 <w:rFonts w:ascii="Microsoft YaHei" w:hAnsi="Microsoft YaHei" w:eastAsia="Microsoft YaHei"/>
                 <w:b w:val="0"/>
-                <w:sz w:val="20"/>
+                <w:color w:val="172033"/>
+                <w:sz w:val="17"/>
               </w:rPr>
               <w:t>星芒账本</w:t>
             </w:r>
@@ -127,83 +149,20 @@
       <w:tr>
         <w:tc>
           <w:tcPr>
-            <w:tcW w:type="dxa" w:w="4997"/>
-            <w:tcMar>
-              <w:top w:w="150" w:type="dxa"/>
-              <w:start w:w="160" w:type="dxa"/>
-              <w:bottom w:w="150" w:type="dxa"/>
-              <w:end w:w="160" w:type="dxa"/>
-            </w:tcMar>
-            <w:shd w:fill="EAF1FF"/>
+            <w:tcW w:type="dxa" w:w="1944"/>
             <w:vAlign w:val="center"/>
           </w:tcPr>
           <w:p>
             <w:pPr>
-              <w:spacing w:after="0" w:line="276" w:lineRule="auto"/>
-            </w:pPr>
-            <w:r/>
-            <w:r>
-              <w:rPr>
-                <w:rFonts w:ascii="Microsoft YaHei" w:hAnsi="Microsoft YaHei" w:eastAsia="Microsoft YaHei"/>
-                <w:b/>
-                <w:color w:val="1D4ED8"/>
-                <w:sz w:val="20"/>
-              </w:rPr>
-              <w:t>开发范围</w:t>
-            </w:r>
-          </w:p>
-        </w:tc>
-        <w:tc>
-          <w:tcPr>
-            <w:tcW w:type="dxa" w:w="4997"/>
-            <w:tcMar>
-              <w:top w:w="150" w:type="dxa"/>
-              <w:start w:w="160" w:type="dxa"/>
-              <w:bottom w:w="150" w:type="dxa"/>
-              <w:end w:w="160" w:type="dxa"/>
-            </w:tcMar>
-            <w:vAlign w:val="center"/>
-          </w:tcPr>
-          <w:p>
-            <w:pPr>
-              <w:spacing w:after="0" w:line="276" w:lineRule="auto"/>
+              <w:spacing w:after="0" w:line="269" w:lineRule="auto"/>
             </w:pPr>
             <w:r/>
             <w:r>
               <w:rPr>
                 <w:rFonts w:ascii="Microsoft YaHei" w:hAnsi="Microsoft YaHei" w:eastAsia="Microsoft YaHei"/>
                 <w:b w:val="0"/>
-                <w:sz w:val="20"/>
-              </w:rPr>
-              <w:t>前端页面、Flask 后端、SQLite 数据库、AI 教练、截图与文档</w:t>
-            </w:r>
-          </w:p>
-        </w:tc>
-      </w:tr>
-      <w:tr>
-        <w:tc>
-          <w:tcPr>
-            <w:tcW w:type="dxa" w:w="4997"/>
-            <w:tcMar>
-              <w:top w:w="150" w:type="dxa"/>
-              <w:start w:w="160" w:type="dxa"/>
-              <w:bottom w:w="150" w:type="dxa"/>
-              <w:end w:w="160" w:type="dxa"/>
-            </w:tcMar>
-            <w:shd w:fill="EAF1FF"/>
-            <w:vAlign w:val="center"/>
-          </w:tcPr>
-          <w:p>
-            <w:pPr>
-              <w:spacing w:after="0" w:line="276" w:lineRule="auto"/>
-            </w:pPr>
-            <w:r/>
-            <w:r>
-              <w:rPr>
-                <w:rFonts w:ascii="Microsoft YaHei" w:hAnsi="Microsoft YaHei" w:eastAsia="Microsoft YaHei"/>
-                <w:b/>
-                <w:color w:val="1D4ED8"/>
-                <w:sz w:val="20"/>
+                <w:color w:val="172033"/>
+                <w:sz w:val="17"/>
               </w:rPr>
               <w:t>测试账号</w:t>
             </w:r>
@@ -211,25 +170,20 @@
         </w:tc>
         <w:tc>
           <w:tcPr>
-            <w:tcW w:type="dxa" w:w="4997"/>
-            <w:tcMar>
-              <w:top w:w="150" w:type="dxa"/>
-              <w:start w:w="160" w:type="dxa"/>
-              <w:bottom w:w="150" w:type="dxa"/>
-              <w:end w:w="160" w:type="dxa"/>
-            </w:tcMar>
+            <w:tcW w:type="dxa" w:w="7488"/>
             <w:vAlign w:val="center"/>
           </w:tcPr>
           <w:p>
             <w:pPr>
-              <w:spacing w:after="0" w:line="276" w:lineRule="auto"/>
+              <w:spacing w:after="0" w:line="269" w:lineRule="auto"/>
             </w:pPr>
             <w:r/>
             <w:r>
               <w:rPr>
                 <w:rFonts w:ascii="Microsoft YaHei" w:hAnsi="Microsoft YaHei" w:eastAsia="Microsoft YaHei"/>
                 <w:b w:val="0"/>
-                <w:sz w:val="20"/>
+                <w:color w:val="172033"/>
+                <w:sz w:val="17"/>
               </w:rPr>
               <w:t>test / 123456</w:t>
             </w:r>
@@ -239,27 +193,64 @@
       <w:tr>
         <w:tc>
           <w:tcPr>
-            <w:tcW w:type="dxa" w:w="4997"/>
-            <w:tcMar>
-              <w:top w:w="150" w:type="dxa"/>
-              <w:start w:w="160" w:type="dxa"/>
-              <w:bottom w:w="150" w:type="dxa"/>
-              <w:end w:w="160" w:type="dxa"/>
-            </w:tcMar>
-            <w:shd w:fill="EAF1FF"/>
+            <w:tcW w:type="dxa" w:w="1944"/>
             <w:vAlign w:val="center"/>
           </w:tcPr>
           <w:p>
             <w:pPr>
-              <w:spacing w:after="0" w:line="276" w:lineRule="auto"/>
+              <w:spacing w:after="0" w:line="269" w:lineRule="auto"/>
             </w:pPr>
             <w:r/>
             <w:r>
               <w:rPr>
                 <w:rFonts w:ascii="Microsoft YaHei" w:hAnsi="Microsoft YaHei" w:eastAsia="Microsoft YaHei"/>
-                <w:b/>
-                <w:color w:val="1D4ED8"/>
-                <w:sz w:val="20"/>
+                <w:b w:val="0"/>
+                <w:color w:val="172033"/>
+                <w:sz w:val="17"/>
+              </w:rPr>
+              <w:t>补全范围</w:t>
+            </w:r>
+          </w:p>
+        </w:tc>
+        <w:tc>
+          <w:tcPr>
+            <w:tcW w:type="dxa" w:w="7488"/>
+            <w:vAlign w:val="center"/>
+          </w:tcPr>
+          <w:p>
+            <w:pPr>
+              <w:spacing w:after="0" w:line="269" w:lineRule="auto"/>
+            </w:pPr>
+            <w:r/>
+            <w:r>
+              <w:rPr>
+                <w:rFonts w:ascii="Microsoft YaHei" w:hAnsi="Microsoft YaHei" w:eastAsia="Microsoft YaHei"/>
+                <w:b w:val="0"/>
+                <w:color w:val="172033"/>
+                <w:sz w:val="17"/>
+              </w:rPr>
+              <w:t>分页、月份过滤、错误日志、移动端输入、趋势图、预算图、文档与截图</w:t>
+            </w:r>
+          </w:p>
+        </w:tc>
+      </w:tr>
+      <w:tr>
+        <w:tc>
+          <w:tcPr>
+            <w:tcW w:type="dxa" w:w="1944"/>
+            <w:vAlign w:val="center"/>
+          </w:tcPr>
+          <w:p>
+            <w:pPr>
+              <w:spacing w:after="0" w:line="269" w:lineRule="auto"/>
+            </w:pPr>
+            <w:r/>
+            <w:r>
+              <w:rPr>
+                <w:rFonts w:ascii="Microsoft YaHei" w:hAnsi="Microsoft YaHei" w:eastAsia="Microsoft YaHei"/>
+                <w:b w:val="0"/>
+                <w:color w:val="172033"/>
+                <w:sz w:val="17"/>
               </w:rPr>
               <w:t>完成日期</w:t>
             </w:r>
@@ -267,25 +258,20 @@
         </w:tc>
         <w:tc>
           <w:tcPr>
-            <w:tcW w:type="dxa" w:w="4997"/>
-            <w:tcMar>
-              <w:top w:w="150" w:type="dxa"/>
-              <w:start w:w="160" w:type="dxa"/>
-              <w:bottom w:w="150" w:type="dxa"/>
-              <w:end w:w="160" w:type="dxa"/>
-            </w:tcMar>
+            <w:tcW w:type="dxa" w:w="7488"/>
             <w:vAlign w:val="center"/>
           </w:tcPr>
           <w:p>
             <w:pPr>
-              <w:spacing w:after="0" w:line="276" w:lineRule="auto"/>
+              <w:spacing w:after="0" w:line="269" w:lineRule="auto"/>
             </w:pPr>
             <w:r/>
             <w:r>
               <w:rPr>
                 <w:rFonts w:ascii="Microsoft YaHei" w:hAnsi="Microsoft YaHei" w:eastAsia="Microsoft YaHei"/>
                 <w:b w:val="0"/>
-                <w:sz w:val="20"/>
+                <w:color w:val="172033"/>
+                <w:sz w:val="17"/>
               </w:rPr>
               <w:t>2026-05-12</w:t>
             </w:r>
@@ -294,18 +280,6 @@
       </w:tr>
     </w:tbl>
     <w:p/>
-    <w:p>
-      <w:pPr>
-        <w:jc w:val="center"/>
-      </w:pPr>
-      <w:r>
-        <w:rPr>
-          <w:color w:val="637083"/>
-          <w:sz w:val="20"/>
-        </w:rPr>
-        <w:t>面向课程验收的完整实现材料：前端页面、Flask 接口、SQLite 数据库、AI 账本教练与测试截图。</w:t>
-      </w:r>
-    </w:p>
     <w:p>
       <w:r>
         <w:br w:type="page"/>
@@ -326,10 +300,11 @@
       <w:r>
         <w:rPr>
           <w:rFonts w:ascii="Microsoft YaHei" w:hAnsi="Microsoft YaHei" w:eastAsia="Microsoft YaHei"/>
+          <w:b w:val="0"/>
           <w:color w:val="172033"/>
           <w:sz w:val="20"/>
         </w:rPr>
-        <w:t>• 完成游客浏览、登录注册、生活仪表盘、记账管理、心愿基金、AI 账本教练 6 个前端视图。</w:t>
+        <w:t>• 完成 6 个前端视图和 13 个 Flask REST 接口。</w:t>
       </w:r>
     </w:p>
     <w:p>
@@ -339,10 +314,11 @@
       <w:r>
         <w:rPr>
           <w:rFonts w:ascii="Microsoft YaHei" w:hAnsi="Microsoft YaHei" w:eastAsia="Microsoft YaHei"/>
+          <w:b w:val="0"/>
           <w:color w:val="172033"/>
           <w:sz w:val="20"/>
         </w:rPr>
-        <w:t>• 完成 13 个 Flask REST 接口，统一返回 code、msg、data。</w:t>
+        <w:t>• 完成 users、categories、ledger_entries、saving_goals 4 张表，且每表不少于 10 条数据。</w:t>
       </w:r>
     </w:p>
     <w:p>
@@ -352,10 +328,11 @@
       <w:r>
         <w:rPr>
           <w:rFonts w:ascii="Microsoft YaHei" w:hAnsi="Microsoft YaHei" w:eastAsia="Microsoft YaHei"/>
+          <w:b w:val="0"/>
           <w:color w:val="172033"/>
           <w:sz w:val="20"/>
         </w:rPr>
-        <w:t>• 完成 users、categories、ledger_entries、saving_goals 4 张数据库表和不少于 10 条演示数据。</w:t>
+        <w:t>• 补齐分页、月份过滤、图表复盘、移动端输入优化和 API 统一错误处理。</w:t>
       </w:r>
     </w:p>
     <w:p>
@@ -365,23 +342,11 @@
       <w:r>
         <w:rPr>
           <w:rFonts w:ascii="Microsoft YaHei" w:hAnsi="Microsoft YaHei" w:eastAsia="Microsoft YaHei"/>
+          <w:b w:val="0"/>
           <w:color w:val="172033"/>
           <w:sz w:val="20"/>
         </w:rPr>
-        <w:t>• 完成 DashScope 国内 AI 接口封装，并提供无 Key 可运行的本地兜底建议。</w:t>
-      </w:r>
-    </w:p>
-    <w:p>
-      <w:pPr>
-        <w:ind w:left="259" w:hanging="173"/>
-      </w:pPr>
-      <w:r>
-        <w:rPr>
-          <w:rFonts w:ascii="Microsoft YaHei" w:hAnsi="Microsoft YaHei" w:eastAsia="Microsoft YaHei"/>
-          <w:color w:val="172033"/>
-          <w:sz w:val="20"/>
-        </w:rPr>
-        <w:t>• 完成课程设计书、开发总结和页面截图更新。</w:t>
+        <w:t>• 完成 DashScope 国内 AI 接口封装，密钥不写入源码。</w:t>
       </w:r>
     </w:p>
     <w:p>
@@ -389,7 +354,7 @@
         <w:pStyle w:val="Heading1"/>
       </w:pPr>
       <w:r>
-        <w:t>2. 开发过程复盘</w:t>
+        <w:t>2. 补全记录</w:t>
       </w:r>
     </w:p>
     <w:tbl>
@@ -408,9 +373,9 @@
         </w:tblBorders>
       </w:tblPr>
       <w:tblGrid>
-        <w:gridCol w:w="3331"/>
-        <w:gridCol w:w="3331"/>
-        <w:gridCol w:w="3331"/>
+        <w:gridCol w:w="3351"/>
+        <w:gridCol w:w="3351"/>
+        <w:gridCol w:w="3351"/>
       </w:tblGrid>
       <w:tr>
         <w:trPr>
@@ -418,19 +383,13 @@
         </w:trPr>
         <w:tc>
           <w:tcPr>
-            <w:tcW w:type="dxa" w:w="1656"/>
+            <w:tcW w:type="dxa" w:w="1584"/>
             <w:shd w:fill="EAF1FF"/>
             <w:vAlign w:val="center"/>
-            <w:tcMar>
-              <w:top w:w="130" w:type="dxa"/>
-              <w:start w:w="120" w:type="dxa"/>
-              <w:bottom w:w="130" w:type="dxa"/>
-              <w:end w:w="120" w:type="dxa"/>
-            </w:tcMar>
           </w:tcPr>
           <w:p>
             <w:pPr>
-              <w:spacing w:after="0" w:line="276" w:lineRule="auto"/>
+              <w:spacing w:after="0" w:line="269" w:lineRule="auto"/>
               <w:jc w:val="center"/>
             </w:pPr>
             <w:r/>
@@ -439,27 +398,21 @@
                 <w:rFonts w:ascii="Microsoft YaHei" w:hAnsi="Microsoft YaHei" w:eastAsia="Microsoft YaHei"/>
                 <w:b/>
                 <w:color w:val="1D4ED8"/>
-                <w:sz w:val="18"/>
+                <w:sz w:val="17"/>
               </w:rPr>
-              <w:t>过程</w:t>
+              <w:t>类型</w:t>
             </w:r>
           </w:p>
         </w:tc>
         <w:tc>
           <w:tcPr>
-            <w:tcW w:type="dxa" w:w="4608"/>
+            <w:tcW w:type="dxa" w:w="5760"/>
             <w:shd w:fill="EAF1FF"/>
             <w:vAlign w:val="center"/>
-            <w:tcMar>
-              <w:top w:w="130" w:type="dxa"/>
-              <w:start w:w="120" w:type="dxa"/>
-              <w:bottom w:w="130" w:type="dxa"/>
-              <w:end w:w="120" w:type="dxa"/>
-            </w:tcMar>
           </w:tcPr>
           <w:p>
             <w:pPr>
-              <w:spacing w:after="0" w:line="276" w:lineRule="auto"/>
+              <w:spacing w:after="0" w:line="269" w:lineRule="auto"/>
               <w:jc w:val="center"/>
             </w:pPr>
             <w:r/>
@@ -468,27 +421,21 @@
                 <w:rFonts w:ascii="Microsoft YaHei" w:hAnsi="Microsoft YaHei" w:eastAsia="Microsoft YaHei"/>
                 <w:b/>
                 <w:color w:val="1D4ED8"/>
-                <w:sz w:val="18"/>
+                <w:sz w:val="17"/>
               </w:rPr>
-              <w:t>具体工作</w:t>
+              <w:t>补全内容</w:t>
             </w:r>
           </w:p>
         </w:tc>
         <w:tc>
           <w:tcPr>
-            <w:tcW w:type="dxa" w:w="3528"/>
+            <w:tcW w:type="dxa" w:w="2592"/>
             <w:shd w:fill="EAF1FF"/>
             <w:vAlign w:val="center"/>
-            <w:tcMar>
-              <w:top w:w="130" w:type="dxa"/>
-              <w:start w:w="120" w:type="dxa"/>
-              <w:bottom w:w="130" w:type="dxa"/>
-              <w:end w:w="120" w:type="dxa"/>
-            </w:tcMar>
           </w:tcPr>
           <w:p>
             <w:pPr>
-              <w:spacing w:after="0" w:line="276" w:lineRule="auto"/>
+              <w:spacing w:after="0" w:line="269" w:lineRule="auto"/>
               <w:jc w:val="center"/>
             </w:pPr>
             <w:r/>
@@ -497,9 +444,9 @@
                 <w:rFonts w:ascii="Microsoft YaHei" w:hAnsi="Microsoft YaHei" w:eastAsia="Microsoft YaHei"/>
                 <w:b/>
                 <w:color w:val="1D4ED8"/>
-                <w:sz w:val="18"/>
+                <w:sz w:val="17"/>
               </w:rPr>
-              <w:t>结果</w:t>
+              <w:t>验证</w:t>
             </w:r>
           </w:p>
         </w:tc>
@@ -507,79 +454,64 @@
       <w:tr>
         <w:tc>
           <w:tcPr>
-            <w:tcW w:type="dxa" w:w="1656"/>
+            <w:tcW w:type="dxa" w:w="1584"/>
             <w:vAlign w:val="center"/>
-            <w:tcMar>
-              <w:top w:w="115" w:type="dxa"/>
-              <w:start w:w="115" w:type="dxa"/>
-              <w:bottom w:w="115" w:type="dxa"/>
-              <w:end w:w="115" w:type="dxa"/>
-            </w:tcMar>
           </w:tcPr>
           <w:p>
             <w:pPr>
-              <w:spacing w:after="0" w:line="276" w:lineRule="auto"/>
+              <w:spacing w:after="0" w:line="269" w:lineRule="auto"/>
             </w:pPr>
             <w:r/>
             <w:r>
               <w:rPr>
                 <w:rFonts w:ascii="Microsoft YaHei" w:hAnsi="Microsoft YaHei" w:eastAsia="Microsoft YaHei"/>
                 <w:b w:val="0"/>
+                <w:color w:val="172033"/>
                 <w:sz w:val="17"/>
               </w:rPr>
-              <w:t>需求拆解</w:t>
+              <w:t>后端</w:t>
             </w:r>
           </w:p>
         </w:tc>
         <w:tc>
           <w:tcPr>
-            <w:tcW w:type="dxa" w:w="4608"/>
+            <w:tcW w:type="dxa" w:w="5760"/>
             <w:vAlign w:val="center"/>
-            <w:tcMar>
-              <w:top w:w="115" w:type="dxa"/>
-              <w:start w:w="115" w:type="dxa"/>
-              <w:bottom w:w="115" w:type="dxa"/>
-              <w:end w:w="115" w:type="dxa"/>
-            </w:tcMar>
           </w:tcPr>
           <w:p>
             <w:pPr>
-              <w:spacing w:after="0" w:line="276" w:lineRule="auto"/>
+              <w:spacing w:after="0" w:line="269" w:lineRule="auto"/>
             </w:pPr>
             <w:r/>
             <w:r>
               <w:rPr>
                 <w:rFonts w:ascii="Microsoft YaHei" w:hAnsi="Microsoft YaHei" w:eastAsia="Microsoft YaHei"/>
                 <w:b w:val="0"/>
+                <w:color w:val="172033"/>
                 <w:sz w:val="17"/>
               </w:rPr>
-              <w:t>将任务书要求拆为页面、接口、数据库、AI、文档五类验收点。</w:t>
+              <w:t>summary 月份过滤、entries 分页、非法参数 400、500 日志、JWT 环境变量。</w:t>
             </w:r>
           </w:p>
         </w:tc>
         <w:tc>
           <w:tcPr>
-            <w:tcW w:type="dxa" w:w="3528"/>
+            <w:tcW w:type="dxa" w:w="2592"/>
             <w:vAlign w:val="center"/>
-            <w:tcMar>
-              <w:top w:w="115" w:type="dxa"/>
-              <w:start w:w="115" w:type="dxa"/>
-              <w:bottom w:w="115" w:type="dxa"/>
-              <w:end w:w="115" w:type="dxa"/>
-            </w:tcMar>
           </w:tcPr>
           <w:p>
             <w:pPr>
-              <w:spacing w:after="0" w:line="276" w:lineRule="auto"/>
+              <w:spacing w:after="0" w:line="269" w:lineRule="auto"/>
             </w:pPr>
             <w:r/>
             <w:r>
               <w:rPr>
                 <w:rFonts w:ascii="Microsoft YaHei" w:hAnsi="Microsoft YaHei" w:eastAsia="Microsoft YaHei"/>
                 <w:b w:val="0"/>
+                <w:color w:val="172033"/>
                 <w:sz w:val="17"/>
               </w:rPr>
-              <w:t>避免遗漏硬性指标。</w:t>
+              <w:t>接口测试通过。</w:t>
             </w:r>
           </w:p>
         </w:tc>
@@ -587,79 +519,64 @@
       <w:tr>
         <w:tc>
           <w:tcPr>
-            <w:tcW w:type="dxa" w:w="1656"/>
+            <w:tcW w:type="dxa" w:w="1584"/>
             <w:vAlign w:val="center"/>
-            <w:tcMar>
-              <w:top w:w="115" w:type="dxa"/>
-              <w:start w:w="115" w:type="dxa"/>
-              <w:bottom w:w="115" w:type="dxa"/>
-              <w:end w:w="115" w:type="dxa"/>
-            </w:tcMar>
           </w:tcPr>
           <w:p>
             <w:pPr>
-              <w:spacing w:after="0" w:line="276" w:lineRule="auto"/>
+              <w:spacing w:after="0" w:line="269" w:lineRule="auto"/>
             </w:pPr>
             <w:r/>
             <w:r>
               <w:rPr>
                 <w:rFonts w:ascii="Microsoft YaHei" w:hAnsi="Microsoft YaHei" w:eastAsia="Microsoft YaHei"/>
                 <w:b w:val="0"/>
+                <w:color w:val="172033"/>
                 <w:sz w:val="17"/>
               </w:rPr>
-              <w:t>数据建模</w:t>
+              <w:t>前端</w:t>
             </w:r>
           </w:p>
         </w:tc>
         <w:tc>
           <w:tcPr>
-            <w:tcW w:type="dxa" w:w="4608"/>
+            <w:tcW w:type="dxa" w:w="5760"/>
             <w:vAlign w:val="center"/>
-            <w:tcMar>
-              <w:top w:w="115" w:type="dxa"/>
-              <w:start w:w="115" w:type="dxa"/>
-              <w:bottom w:w="115" w:type="dxa"/>
-              <w:end w:w="115" w:type="dxa"/>
-            </w:tcMar>
           </w:tcPr>
           <w:p>
             <w:pPr>
-              <w:spacing w:after="0" w:line="276" w:lineRule="auto"/>
+              <w:spacing w:after="0" w:line="269" w:lineRule="auto"/>
             </w:pPr>
             <w:r/>
             <w:r>
               <w:rPr>
                 <w:rFonts w:ascii="Microsoft YaHei" w:hAnsi="Microsoft YaHei" w:eastAsia="Microsoft YaHei"/>
                 <w:b w:val="0"/>
+                <w:color w:val="172033"/>
                 <w:sz w:val="17"/>
               </w:rPr>
-              <w:t>围绕学生账本设计用户、分类、账目、目标四类实体。</w:t>
+              <w:t>仪表盘月份控件、六个月趋势、预算使用率、账目筛选分页、移动端输入属性。</w:t>
             </w:r>
           </w:p>
         </w:tc>
         <w:tc>
           <w:tcPr>
-            <w:tcW w:type="dxa" w:w="3528"/>
+            <w:tcW w:type="dxa" w:w="2592"/>
             <w:vAlign w:val="center"/>
-            <w:tcMar>
-              <w:top w:w="115" w:type="dxa"/>
-              <w:start w:w="115" w:type="dxa"/>
-              <w:bottom w:w="115" w:type="dxa"/>
-              <w:end w:w="115" w:type="dxa"/>
-            </w:tcMar>
           </w:tcPr>
           <w:p>
             <w:pPr>
-              <w:spacing w:after="0" w:line="276" w:lineRule="auto"/>
+              <w:spacing w:after="0" w:line="269" w:lineRule="auto"/>
             </w:pPr>
             <w:r/>
             <w:r>
               <w:rPr>
                 <w:rFonts w:ascii="Microsoft YaHei" w:hAnsi="Microsoft YaHei" w:eastAsia="Microsoft YaHei"/>
                 <w:b w:val="0"/>
+                <w:color w:val="172033"/>
                 <w:sz w:val="17"/>
               </w:rPr>
-              <w:t>支持游客展示、个人账目和心愿基金。</w:t>
+              <w:t>桌面和移动端浏览器验证通过。</w:t>
             </w:r>
           </w:p>
         </w:tc>
@@ -667,239 +584,64 @@
       <w:tr>
         <w:tc>
           <w:tcPr>
-            <w:tcW w:type="dxa" w:w="1656"/>
+            <w:tcW w:type="dxa" w:w="1584"/>
             <w:vAlign w:val="center"/>
-            <w:tcMar>
-              <w:top w:w="115" w:type="dxa"/>
-              <w:start w:w="115" w:type="dxa"/>
-              <w:bottom w:w="115" w:type="dxa"/>
-              <w:end w:w="115" w:type="dxa"/>
-            </w:tcMar>
           </w:tcPr>
           <w:p>
             <w:pPr>
-              <w:spacing w:after="0" w:line="276" w:lineRule="auto"/>
+              <w:spacing w:after="0" w:line="269" w:lineRule="auto"/>
             </w:pPr>
             <w:r/>
             <w:r>
               <w:rPr>
                 <w:rFonts w:ascii="Microsoft YaHei" w:hAnsi="Microsoft YaHei" w:eastAsia="Microsoft YaHei"/>
                 <w:b w:val="0"/>
+                <w:color w:val="172033"/>
                 <w:sz w:val="17"/>
               </w:rPr>
-              <w:t>接口实现</w:t>
+              <w:t>材料</w:t>
             </w:r>
           </w:p>
         </w:tc>
         <w:tc>
           <w:tcPr>
-            <w:tcW w:type="dxa" w:w="4608"/>
+            <w:tcW w:type="dxa" w:w="5760"/>
             <w:vAlign w:val="center"/>
-            <w:tcMar>
-              <w:top w:w="115" w:type="dxa"/>
-              <w:start w:w="115" w:type="dxa"/>
-              <w:bottom w:w="115" w:type="dxa"/>
-              <w:end w:w="115" w:type="dxa"/>
-            </w:tcMar>
           </w:tcPr>
           <w:p>
             <w:pPr>
-              <w:spacing w:after="0" w:line="276" w:lineRule="auto"/>
+              <w:spacing w:after="0" w:line="269" w:lineRule="auto"/>
             </w:pPr>
             <w:r/>
             <w:r>
               <w:rPr>
                 <w:rFonts w:ascii="Microsoft YaHei" w:hAnsi="Microsoft YaHei" w:eastAsia="Microsoft YaHei"/>
                 <w:b w:val="0"/>
+                <w:color w:val="172033"/>
                 <w:sz w:val="17"/>
               </w:rPr>
-              <w:t>用 Flask Blueprint 实现认证、汇总、CRUD、目标、AI。</w:t>
+              <w:t>截图和文档更新为补全后的页面。</w:t>
             </w:r>
           </w:p>
         </w:tc>
         <w:tc>
           <w:tcPr>
-            <w:tcW w:type="dxa" w:w="3528"/>
+            <w:tcW w:type="dxa" w:w="2592"/>
             <w:vAlign w:val="center"/>
-            <w:tcMar>
-              <w:top w:w="115" w:type="dxa"/>
-              <w:start w:w="115" w:type="dxa"/>
-              <w:bottom w:w="115" w:type="dxa"/>
-              <w:end w:w="115" w:type="dxa"/>
-            </w:tcMar>
           </w:tcPr>
           <w:p>
             <w:pPr>
-              <w:spacing w:after="0" w:line="276" w:lineRule="auto"/>
+              <w:spacing w:after="0" w:line="269" w:lineRule="auto"/>
             </w:pPr>
             <w:r/>
             <w:r>
               <w:rPr>
                 <w:rFonts w:ascii="Microsoft YaHei" w:hAnsi="Microsoft YaHei" w:eastAsia="Microsoft YaHei"/>
                 <w:b w:val="0"/>
+                <w:color w:val="172033"/>
                 <w:sz w:val="17"/>
               </w:rPr>
-              <w:t>接口边界清晰，便于测试。</w:t>
-            </w:r>
-          </w:p>
-        </w:tc>
-      </w:tr>
-      <w:tr>
-        <w:tc>
-          <w:tcPr>
-            <w:tcW w:type="dxa" w:w="1656"/>
-            <w:vAlign w:val="center"/>
-            <w:tcMar>
-              <w:top w:w="115" w:type="dxa"/>
-              <w:start w:w="115" w:type="dxa"/>
-              <w:bottom w:w="115" w:type="dxa"/>
-              <w:end w:w="115" w:type="dxa"/>
-            </w:tcMar>
-          </w:tcPr>
-          <w:p>
-            <w:pPr>
-              <w:spacing w:after="0" w:line="276" w:lineRule="auto"/>
-            </w:pPr>
-            <w:r/>
-            <w:r>
-              <w:rPr>
-                <w:rFonts w:ascii="Microsoft YaHei" w:hAnsi="Microsoft YaHei" w:eastAsia="Microsoft YaHei"/>
-                <w:b w:val="0"/>
-                <w:sz w:val="17"/>
-              </w:rPr>
-              <w:t>前端实现</w:t>
-            </w:r>
-          </w:p>
-        </w:tc>
-        <w:tc>
-          <w:tcPr>
-            <w:tcW w:type="dxa" w:w="4608"/>
-            <w:vAlign w:val="center"/>
-            <w:tcMar>
-              <w:top w:w="115" w:type="dxa"/>
-              <w:start w:w="115" w:type="dxa"/>
-              <w:bottom w:w="115" w:type="dxa"/>
-              <w:end w:w="115" w:type="dxa"/>
-            </w:tcMar>
-          </w:tcPr>
-          <w:p>
-            <w:pPr>
-              <w:spacing w:after="0" w:line="276" w:lineRule="auto"/>
-            </w:pPr>
-            <w:r/>
-            <w:r>
-              <w:rPr>
-                <w:rFonts w:ascii="Microsoft YaHei" w:hAnsi="Microsoft YaHei" w:eastAsia="Microsoft YaHei"/>
-                <w:b w:val="0"/>
-                <w:sz w:val="17"/>
-              </w:rPr>
-              <w:t>用原生 JS 管理状态、路由切换、表单和列表渲染。</w:t>
-            </w:r>
-          </w:p>
-        </w:tc>
-        <w:tc>
-          <w:tcPr>
-            <w:tcW w:type="dxa" w:w="3528"/>
-            <w:vAlign w:val="center"/>
-            <w:tcMar>
-              <w:top w:w="115" w:type="dxa"/>
-              <w:start w:w="115" w:type="dxa"/>
-              <w:bottom w:w="115" w:type="dxa"/>
-              <w:end w:w="115" w:type="dxa"/>
-            </w:tcMar>
-          </w:tcPr>
-          <w:p>
-            <w:pPr>
-              <w:spacing w:after="0" w:line="276" w:lineRule="auto"/>
-            </w:pPr>
-            <w:r/>
-            <w:r>
-              <w:rPr>
-                <w:rFonts w:ascii="Microsoft YaHei" w:hAnsi="Microsoft YaHei" w:eastAsia="Microsoft YaHei"/>
-                <w:b w:val="0"/>
-                <w:sz w:val="17"/>
-              </w:rPr>
-              <w:t>无需复杂构建步骤，演示启动简单。</w:t>
-            </w:r>
-          </w:p>
-        </w:tc>
-      </w:tr>
-      <w:tr>
-        <w:tc>
-          <w:tcPr>
-            <w:tcW w:type="dxa" w:w="1656"/>
-            <w:vAlign w:val="center"/>
-            <w:tcMar>
-              <w:top w:w="115" w:type="dxa"/>
-              <w:start w:w="115" w:type="dxa"/>
-              <w:bottom w:w="115" w:type="dxa"/>
-              <w:end w:w="115" w:type="dxa"/>
-            </w:tcMar>
-          </w:tcPr>
-          <w:p>
-            <w:pPr>
-              <w:spacing w:after="0" w:line="276" w:lineRule="auto"/>
-            </w:pPr>
-            <w:r/>
-            <w:r>
-              <w:rPr>
-                <w:rFonts w:ascii="Microsoft YaHei" w:hAnsi="Microsoft YaHei" w:eastAsia="Microsoft YaHei"/>
-                <w:b w:val="0"/>
-                <w:sz w:val="17"/>
-              </w:rPr>
-              <w:t>测试整理</w:t>
-            </w:r>
-          </w:p>
-        </w:tc>
-        <w:tc>
-          <w:tcPr>
-            <w:tcW w:type="dxa" w:w="4608"/>
-            <w:vAlign w:val="center"/>
-            <w:tcMar>
-              <w:top w:w="115" w:type="dxa"/>
-              <w:start w:w="115" w:type="dxa"/>
-              <w:bottom w:w="115" w:type="dxa"/>
-              <w:end w:w="115" w:type="dxa"/>
-            </w:tcMar>
-          </w:tcPr>
-          <w:p>
-            <w:pPr>
-              <w:spacing w:after="0" w:line="276" w:lineRule="auto"/>
-            </w:pPr>
-            <w:r/>
-            <w:r>
-              <w:rPr>
-                <w:rFonts w:ascii="Microsoft YaHei" w:hAnsi="Microsoft YaHei" w:eastAsia="Microsoft YaHei"/>
-                <w:b w:val="0"/>
-                <w:sz w:val="17"/>
-              </w:rPr>
-              <w:t>浏览器截图、接口测试、清理旧截图和旧文档。</w:t>
-            </w:r>
-          </w:p>
-        </w:tc>
-        <w:tc>
-          <w:tcPr>
-            <w:tcW w:type="dxa" w:w="3528"/>
-            <w:vAlign w:val="center"/>
-            <w:tcMar>
-              <w:top w:w="115" w:type="dxa"/>
-              <w:start w:w="115" w:type="dxa"/>
-              <w:bottom w:w="115" w:type="dxa"/>
-              <w:end w:w="115" w:type="dxa"/>
-            </w:tcMar>
-          </w:tcPr>
-          <w:p>
-            <w:pPr>
-              <w:spacing w:after="0" w:line="276" w:lineRule="auto"/>
-            </w:pPr>
-            <w:r/>
-            <w:r>
-              <w:rPr>
-                <w:rFonts w:ascii="Microsoft YaHei" w:hAnsi="Microsoft YaHei" w:eastAsia="Microsoft YaHei"/>
-                <w:b w:val="0"/>
-                <w:sz w:val="17"/>
-              </w:rPr>
-              <w:t>交付材料与当前项目一致。</w:t>
+              <w:t>DOCX 渲染检查通过。</w:t>
             </w:r>
           </w:p>
         </w:tc>
@@ -911,514 +653,7 @@
         <w:pStyle w:val="Heading1"/>
       </w:pPr>
       <w:r>
-        <w:t>3. 主要问题与处理</w:t>
-      </w:r>
-    </w:p>
-    <w:tbl>
-      <w:tblPr>
-        <w:tblStyle w:val="TableGrid"/>
-        <w:tblW w:type="auto" w:w="0"/>
-        <w:jc w:val="center"/>
-        <w:tblLook w:firstColumn="1" w:firstRow="1" w:lastColumn="0" w:lastRow="0" w:noHBand="0" w:noVBand="1" w:val="04A0"/>
-        <w:tblBorders>
-          <w:top w:val="single" w:sz="6" w:space="0" w:color="D9E1EC"/>
-          <w:left w:val="single" w:sz="6" w:space="0" w:color="D9E1EC"/>
-          <w:bottom w:val="single" w:sz="6" w:space="0" w:color="D9E1EC"/>
-          <w:right w:val="single" w:sz="6" w:space="0" w:color="D9E1EC"/>
-          <w:insideH w:val="single" w:sz="6" w:space="0" w:color="D9E1EC"/>
-          <w:insideV w:val="single" w:sz="6" w:space="0" w:color="D9E1EC"/>
-        </w:tblBorders>
-      </w:tblPr>
-      <w:tblGrid>
-        <w:gridCol w:w="3331"/>
-        <w:gridCol w:w="3331"/>
-        <w:gridCol w:w="3331"/>
-      </w:tblGrid>
-      <w:tr>
-        <w:trPr>
-          <w:tblHeader w:val="true"/>
-        </w:trPr>
-        <w:tc>
-          <w:tcPr>
-            <w:tcW w:type="dxa" w:w="2376"/>
-            <w:shd w:fill="EAF1FF"/>
-            <w:vAlign w:val="center"/>
-            <w:tcMar>
-              <w:top w:w="130" w:type="dxa"/>
-              <w:start w:w="120" w:type="dxa"/>
-              <w:bottom w:w="130" w:type="dxa"/>
-              <w:end w:w="120" w:type="dxa"/>
-            </w:tcMar>
-          </w:tcPr>
-          <w:p>
-            <w:pPr>
-              <w:spacing w:after="0" w:line="276" w:lineRule="auto"/>
-              <w:jc w:val="center"/>
-            </w:pPr>
-            <w:r/>
-            <w:r>
-              <w:rPr>
-                <w:rFonts w:ascii="Microsoft YaHei" w:hAnsi="Microsoft YaHei" w:eastAsia="Microsoft YaHei"/>
-                <w:b/>
-                <w:color w:val="1D4ED8"/>
-                <w:sz w:val="18"/>
-              </w:rPr>
-              <w:t>问题</w:t>
-            </w:r>
-          </w:p>
-        </w:tc>
-        <w:tc>
-          <w:tcPr>
-            <w:tcW w:type="dxa" w:w="4320"/>
-            <w:shd w:fill="EAF1FF"/>
-            <w:vAlign w:val="center"/>
-            <w:tcMar>
-              <w:top w:w="130" w:type="dxa"/>
-              <w:start w:w="120" w:type="dxa"/>
-              <w:bottom w:w="130" w:type="dxa"/>
-              <w:end w:w="120" w:type="dxa"/>
-            </w:tcMar>
-          </w:tcPr>
-          <w:p>
-            <w:pPr>
-              <w:spacing w:after="0" w:line="276" w:lineRule="auto"/>
-              <w:jc w:val="center"/>
-            </w:pPr>
-            <w:r/>
-            <w:r>
-              <w:rPr>
-                <w:rFonts w:ascii="Microsoft YaHei" w:hAnsi="Microsoft YaHei" w:eastAsia="Microsoft YaHei"/>
-                <w:b/>
-                <w:color w:val="1D4ED8"/>
-                <w:sz w:val="18"/>
-              </w:rPr>
-              <w:t>处理方式</w:t>
-            </w:r>
-          </w:p>
-        </w:tc>
-        <w:tc>
-          <w:tcPr>
-            <w:tcW w:type="dxa" w:w="3096"/>
-            <w:shd w:fill="EAF1FF"/>
-            <w:vAlign w:val="center"/>
-            <w:tcMar>
-              <w:top w:w="130" w:type="dxa"/>
-              <w:start w:w="120" w:type="dxa"/>
-              <w:bottom w:w="130" w:type="dxa"/>
-              <w:end w:w="120" w:type="dxa"/>
-            </w:tcMar>
-          </w:tcPr>
-          <w:p>
-            <w:pPr>
-              <w:spacing w:after="0" w:line="276" w:lineRule="auto"/>
-              <w:jc w:val="center"/>
-            </w:pPr>
-            <w:r/>
-            <w:r>
-              <w:rPr>
-                <w:rFonts w:ascii="Microsoft YaHei" w:hAnsi="Microsoft YaHei" w:eastAsia="Microsoft YaHei"/>
-                <w:b/>
-                <w:color w:val="1D4ED8"/>
-                <w:sz w:val="18"/>
-              </w:rPr>
-              <w:t>经验</w:t>
-            </w:r>
-          </w:p>
-        </w:tc>
-      </w:tr>
-      <w:tr>
-        <w:tc>
-          <w:tcPr>
-            <w:tcW w:type="dxa" w:w="2376"/>
-            <w:vAlign w:val="center"/>
-            <w:tcMar>
-              <w:top w:w="115" w:type="dxa"/>
-              <w:start w:w="115" w:type="dxa"/>
-              <w:bottom w:w="115" w:type="dxa"/>
-              <w:end w:w="115" w:type="dxa"/>
-            </w:tcMar>
-          </w:tcPr>
-          <w:p>
-            <w:pPr>
-              <w:spacing w:after="0" w:line="276" w:lineRule="auto"/>
-            </w:pPr>
-            <w:r/>
-            <w:r>
-              <w:rPr>
-                <w:rFonts w:ascii="Microsoft YaHei" w:hAnsi="Microsoft YaHei" w:eastAsia="Microsoft YaHei"/>
-                <w:b w:val="0"/>
-                <w:sz w:val="17"/>
-              </w:rPr>
-              <w:t>AI Key 不适合写入源码</w:t>
-            </w:r>
-          </w:p>
-        </w:tc>
-        <w:tc>
-          <w:tcPr>
-            <w:tcW w:type="dxa" w:w="4320"/>
-            <w:vAlign w:val="center"/>
-            <w:tcMar>
-              <w:top w:w="115" w:type="dxa"/>
-              <w:start w:w="115" w:type="dxa"/>
-              <w:bottom w:w="115" w:type="dxa"/>
-              <w:end w:w="115" w:type="dxa"/>
-            </w:tcMar>
-          </w:tcPr>
-          <w:p>
-            <w:pPr>
-              <w:spacing w:after="0" w:line="276" w:lineRule="auto"/>
-            </w:pPr>
-            <w:r/>
-            <w:r>
-              <w:rPr>
-                <w:rFonts w:ascii="Microsoft YaHei" w:hAnsi="Microsoft YaHei" w:eastAsia="Microsoft YaHei"/>
-                <w:b w:val="0"/>
-                <w:sz w:val="17"/>
-              </w:rPr>
-              <w:t>改为读取 DASHSCOPE_API_KEY，并在未配置时返回本地建议。</w:t>
-            </w:r>
-          </w:p>
-        </w:tc>
-        <w:tc>
-          <w:tcPr>
-            <w:tcW w:type="dxa" w:w="3096"/>
-            <w:vAlign w:val="center"/>
-            <w:tcMar>
-              <w:top w:w="115" w:type="dxa"/>
-              <w:start w:w="115" w:type="dxa"/>
-              <w:bottom w:w="115" w:type="dxa"/>
-              <w:end w:w="115" w:type="dxa"/>
-            </w:tcMar>
-          </w:tcPr>
-          <w:p>
-            <w:pPr>
-              <w:spacing w:after="0" w:line="276" w:lineRule="auto"/>
-            </w:pPr>
-            <w:r/>
-            <w:r>
-              <w:rPr>
-                <w:rFonts w:ascii="Microsoft YaHei" w:hAnsi="Microsoft YaHei" w:eastAsia="Microsoft YaHei"/>
-                <w:b w:val="0"/>
-                <w:sz w:val="17"/>
-              </w:rPr>
-              <w:t>外部服务要隔离配置与业务逻辑。</w:t>
-            </w:r>
-          </w:p>
-        </w:tc>
-      </w:tr>
-      <w:tr>
-        <w:tc>
-          <w:tcPr>
-            <w:tcW w:type="dxa" w:w="2376"/>
-            <w:vAlign w:val="center"/>
-            <w:tcMar>
-              <w:top w:w="115" w:type="dxa"/>
-              <w:start w:w="115" w:type="dxa"/>
-              <w:bottom w:w="115" w:type="dxa"/>
-              <w:end w:w="115" w:type="dxa"/>
-            </w:tcMar>
-          </w:tcPr>
-          <w:p>
-            <w:pPr>
-              <w:spacing w:after="0" w:line="276" w:lineRule="auto"/>
-            </w:pPr>
-            <w:r/>
-            <w:r>
-              <w:rPr>
-                <w:rFonts w:ascii="Microsoft YaHei" w:hAnsi="Microsoft YaHei" w:eastAsia="Microsoft YaHei"/>
-                <w:b w:val="0"/>
-                <w:sz w:val="17"/>
-              </w:rPr>
-              <w:t>课程验收需要固定演示数据</w:t>
-            </w:r>
-          </w:p>
-        </w:tc>
-        <w:tc>
-          <w:tcPr>
-            <w:tcW w:type="dxa" w:w="4320"/>
-            <w:vAlign w:val="center"/>
-            <w:tcMar>
-              <w:top w:w="115" w:type="dxa"/>
-              <w:start w:w="115" w:type="dxa"/>
-              <w:bottom w:w="115" w:type="dxa"/>
-              <w:end w:w="115" w:type="dxa"/>
-            </w:tcMar>
-          </w:tcPr>
-          <w:p>
-            <w:pPr>
-              <w:spacing w:after="0" w:line="276" w:lineRule="auto"/>
-            </w:pPr>
-            <w:r/>
-            <w:r>
-              <w:rPr>
-                <w:rFonts w:ascii="Microsoft YaHei" w:hAnsi="Microsoft YaHei" w:eastAsia="Microsoft YaHei"/>
-                <w:b w:val="0"/>
-                <w:sz w:val="17"/>
-              </w:rPr>
-              <w:t>应用启动时自动建表并种子用户、分类、账目和目标。</w:t>
-            </w:r>
-          </w:p>
-        </w:tc>
-        <w:tc>
-          <w:tcPr>
-            <w:tcW w:type="dxa" w:w="3096"/>
-            <w:vAlign w:val="center"/>
-            <w:tcMar>
-              <w:top w:w="115" w:type="dxa"/>
-              <w:start w:w="115" w:type="dxa"/>
-              <w:bottom w:w="115" w:type="dxa"/>
-              <w:end w:w="115" w:type="dxa"/>
-            </w:tcMar>
-          </w:tcPr>
-          <w:p>
-            <w:pPr>
-              <w:spacing w:after="0" w:line="276" w:lineRule="auto"/>
-            </w:pPr>
-            <w:r/>
-            <w:r>
-              <w:rPr>
-                <w:rFonts w:ascii="Microsoft YaHei" w:hAnsi="Microsoft YaHei" w:eastAsia="Microsoft YaHei"/>
-                <w:b w:val="0"/>
-                <w:sz w:val="17"/>
-              </w:rPr>
-              <w:t>可复现数据能降低演示风险。</w:t>
-            </w:r>
-          </w:p>
-        </w:tc>
-      </w:tr>
-      <w:tr>
-        <w:tc>
-          <w:tcPr>
-            <w:tcW w:type="dxa" w:w="2376"/>
-            <w:vAlign w:val="center"/>
-            <w:tcMar>
-              <w:top w:w="115" w:type="dxa"/>
-              <w:start w:w="115" w:type="dxa"/>
-              <w:bottom w:w="115" w:type="dxa"/>
-              <w:end w:w="115" w:type="dxa"/>
-            </w:tcMar>
-          </w:tcPr>
-          <w:p>
-            <w:pPr>
-              <w:spacing w:after="0" w:line="276" w:lineRule="auto"/>
-            </w:pPr>
-            <w:r/>
-            <w:r>
-              <w:rPr>
-                <w:rFonts w:ascii="Microsoft YaHei" w:hAnsi="Microsoft YaHei" w:eastAsia="Microsoft YaHei"/>
-                <w:b w:val="0"/>
-                <w:sz w:val="17"/>
-              </w:rPr>
-              <w:t>游客和登录用户权限不同</w:t>
-            </w:r>
-          </w:p>
-        </w:tc>
-        <w:tc>
-          <w:tcPr>
-            <w:tcW w:type="dxa" w:w="4320"/>
-            <w:vAlign w:val="center"/>
-            <w:tcMar>
-              <w:top w:w="115" w:type="dxa"/>
-              <w:start w:w="115" w:type="dxa"/>
-              <w:bottom w:w="115" w:type="dxa"/>
-              <w:end w:w="115" w:type="dxa"/>
-            </w:tcMar>
-          </w:tcPr>
-          <w:p>
-            <w:pPr>
-              <w:spacing w:after="0" w:line="276" w:lineRule="auto"/>
-            </w:pPr>
-            <w:r/>
-            <w:r>
-              <w:rPr>
-                <w:rFonts w:ascii="Microsoft YaHei" w:hAnsi="Microsoft YaHei" w:eastAsia="Microsoft YaHei"/>
-                <w:b w:val="0"/>
-                <w:sz w:val="17"/>
-              </w:rPr>
-              <w:t>公开接口与 JWT 接口分离，个人数据按 user_id 查询。</w:t>
-            </w:r>
-          </w:p>
-        </w:tc>
-        <w:tc>
-          <w:tcPr>
-            <w:tcW w:type="dxa" w:w="3096"/>
-            <w:vAlign w:val="center"/>
-            <w:tcMar>
-              <w:top w:w="115" w:type="dxa"/>
-              <w:start w:w="115" w:type="dxa"/>
-              <w:bottom w:w="115" w:type="dxa"/>
-              <w:end w:w="115" w:type="dxa"/>
-            </w:tcMar>
-          </w:tcPr>
-          <w:p>
-            <w:pPr>
-              <w:spacing w:after="0" w:line="276" w:lineRule="auto"/>
-            </w:pPr>
-            <w:r/>
-            <w:r>
-              <w:rPr>
-                <w:rFonts w:ascii="Microsoft YaHei" w:hAnsi="Microsoft YaHei" w:eastAsia="Microsoft YaHei"/>
-                <w:b w:val="0"/>
-                <w:sz w:val="17"/>
-              </w:rPr>
-              <w:t>权限边界要体现在接口层。</w:t>
-            </w:r>
-          </w:p>
-        </w:tc>
-      </w:tr>
-      <w:tr>
-        <w:tc>
-          <w:tcPr>
-            <w:tcW w:type="dxa" w:w="2376"/>
-            <w:vAlign w:val="center"/>
-            <w:tcMar>
-              <w:top w:w="115" w:type="dxa"/>
-              <w:start w:w="115" w:type="dxa"/>
-              <w:bottom w:w="115" w:type="dxa"/>
-              <w:end w:w="115" w:type="dxa"/>
-            </w:tcMar>
-          </w:tcPr>
-          <w:p>
-            <w:pPr>
-              <w:spacing w:after="0" w:line="276" w:lineRule="auto"/>
-            </w:pPr>
-            <w:r/>
-            <w:r>
-              <w:rPr>
-                <w:rFonts w:ascii="Microsoft YaHei" w:hAnsi="Microsoft YaHei" w:eastAsia="Microsoft YaHei"/>
-                <w:b w:val="0"/>
-                <w:sz w:val="17"/>
-              </w:rPr>
-              <w:t>旧截图与新项目不一致</w:t>
-            </w:r>
-          </w:p>
-        </w:tc>
-        <w:tc>
-          <w:tcPr>
-            <w:tcW w:type="dxa" w:w="4320"/>
-            <w:vAlign w:val="center"/>
-            <w:tcMar>
-              <w:top w:w="115" w:type="dxa"/>
-              <w:start w:w="115" w:type="dxa"/>
-              <w:bottom w:w="115" w:type="dxa"/>
-              <w:end w:w="115" w:type="dxa"/>
-            </w:tcMar>
-          </w:tcPr>
-          <w:p>
-            <w:pPr>
-              <w:spacing w:after="0" w:line="276" w:lineRule="auto"/>
-            </w:pPr>
-            <w:r/>
-            <w:r>
-              <w:rPr>
-                <w:rFonts w:ascii="Microsoft YaHei" w:hAnsi="Microsoft YaHei" w:eastAsia="Microsoft YaHei"/>
-                <w:b w:val="0"/>
-                <w:sz w:val="17"/>
-              </w:rPr>
-              <w:t>重新使用浏览器生成 6 张当前页面截图。</w:t>
-            </w:r>
-          </w:p>
-        </w:tc>
-        <w:tc>
-          <w:tcPr>
-            <w:tcW w:type="dxa" w:w="3096"/>
-            <w:vAlign w:val="center"/>
-            <w:tcMar>
-              <w:top w:w="115" w:type="dxa"/>
-              <w:start w:w="115" w:type="dxa"/>
-              <w:bottom w:w="115" w:type="dxa"/>
-              <w:end w:w="115" w:type="dxa"/>
-            </w:tcMar>
-          </w:tcPr>
-          <w:p>
-            <w:pPr>
-              <w:spacing w:after="0" w:line="276" w:lineRule="auto"/>
-            </w:pPr>
-            <w:r/>
-            <w:r>
-              <w:rPr>
-                <w:rFonts w:ascii="Microsoft YaHei" w:hAnsi="Microsoft YaHei" w:eastAsia="Microsoft YaHei"/>
-                <w:b w:val="0"/>
-                <w:sz w:val="17"/>
-              </w:rPr>
-              <w:t>交付材料必须跟实际运行结果一致。</w:t>
-            </w:r>
-          </w:p>
-        </w:tc>
-      </w:tr>
-    </w:tbl>
-    <w:p/>
-    <w:p>
-      <w:pPr>
-        <w:pStyle w:val="Heading1"/>
-      </w:pPr>
-      <w:r>
-        <w:t>4. 测试摘要</w:t>
-      </w:r>
-    </w:p>
-    <w:p>
-      <w:pPr>
-        <w:ind w:left="259" w:hanging="173"/>
-      </w:pPr>
-      <w:r>
-        <w:rPr>
-          <w:rFonts w:ascii="Microsoft YaHei" w:hAnsi="Microsoft YaHei" w:eastAsia="Microsoft YaHei"/>
-          <w:color w:val="172033"/>
-          <w:sz w:val="20"/>
-        </w:rPr>
-        <w:t>• 公开接口：/api/public/overview、/api/public/categories 返回正常。</w:t>
-      </w:r>
-    </w:p>
-    <w:p>
-      <w:pPr>
-        <w:ind w:left="259" w:hanging="173"/>
-      </w:pPr>
-      <w:r>
-        <w:rPr>
-          <w:rFonts w:ascii="Microsoft YaHei" w:hAnsi="Microsoft YaHei" w:eastAsia="Microsoft YaHei"/>
-          <w:color w:val="172033"/>
-          <w:sz w:val="20"/>
-        </w:rPr>
-        <w:t>• 认证接口：test / 123456 登录成功，Token 可访问 /api/auth/me。</w:t>
-      </w:r>
-    </w:p>
-    <w:p>
-      <w:pPr>
-        <w:ind w:left="259" w:hanging="173"/>
-      </w:pPr>
-      <w:r>
-        <w:rPr>
-          <w:rFonts w:ascii="Microsoft YaHei" w:hAnsi="Microsoft YaHei" w:eastAsia="Microsoft YaHei"/>
-          <w:color w:val="172033"/>
-          <w:sz w:val="20"/>
-        </w:rPr>
-        <w:t>• 账目接口：新增、查询、修改、删除链路通过。</w:t>
-      </w:r>
-    </w:p>
-    <w:p>
-      <w:pPr>
-        <w:ind w:left="259" w:hanging="173"/>
-      </w:pPr>
-      <w:r>
-        <w:rPr>
-          <w:rFonts w:ascii="Microsoft YaHei" w:hAnsi="Microsoft YaHei" w:eastAsia="Microsoft YaHei"/>
-          <w:color w:val="172033"/>
-          <w:sz w:val="20"/>
-        </w:rPr>
-        <w:t>• 心愿基金接口：返回 10 条目标数据及完成进度。</w:t>
-      </w:r>
-    </w:p>
-    <w:p>
-      <w:pPr>
-        <w:ind w:left="259" w:hanging="173"/>
-      </w:pPr>
-      <w:r>
-        <w:rPr>
-          <w:rFonts w:ascii="Microsoft YaHei" w:hAnsi="Microsoft YaHei" w:eastAsia="Microsoft YaHei"/>
-          <w:color w:val="172033"/>
-          <w:sz w:val="20"/>
-        </w:rPr>
-        <w:t>• AI 接口：未配置真实 Key 时返回带上下文的本地预算建议，演示不中断。</w:t>
+        <w:t>3. 截图证据</w:t>
       </w:r>
     </w:p>
     <w:p>
@@ -1428,7 +663,7 @@
       <w:r>
         <w:drawing>
           <wp:inline xmlns:a="http://schemas.openxmlformats.org/drawingml/2006/main" xmlns:pic="http://schemas.openxmlformats.org/drawingml/2006/picture">
-            <wp:extent cx="5074920" cy="3524250"/>
+            <wp:extent cx="5394960" cy="5035296"/>
             <wp:docPr id="1" name="Picture 1"/>
             <wp:cNvGraphicFramePr>
               <a:graphicFrameLocks noChangeAspect="1"/>
@@ -1449,7 +684,7 @@
                   <pic:spPr>
                     <a:xfrm>
                       <a:off x="0" y="0"/>
-                      <a:ext cx="5074920" cy="3524250"/>
+                      <a:ext cx="5394960" cy="5035296"/>
                     </a:xfrm>
                     <a:prstGeom prst="rect"/>
                   </pic:spPr>
@@ -1462,16 +697,16 @@
     </w:p>
     <w:p>
       <w:pPr>
-        <w:spacing w:after="160"/>
         <w:jc w:val="center"/>
       </w:pPr>
       <w:r>
         <w:rPr>
           <w:rFonts w:ascii="Microsoft YaHei" w:hAnsi="Microsoft YaHei" w:eastAsia="Microsoft YaHei"/>
+          <w:b w:val="0"/>
           <w:color w:val="637083"/>
-          <w:sz w:val="18"/>
+          <w:sz w:val="17"/>
         </w:rPr>
-        <w:t>图 1 仪表盘测试截图</w:t>
+        <w:t>图 1 补全后的仪表盘</w:t>
       </w:r>
     </w:p>
     <w:p>
@@ -1481,7 +716,7 @@
       <w:r>
         <w:drawing>
           <wp:inline xmlns:a="http://schemas.openxmlformats.org/drawingml/2006/main" xmlns:pic="http://schemas.openxmlformats.org/drawingml/2006/picture">
-            <wp:extent cx="4069080" cy="4998751"/>
+            <wp:extent cx="4892040" cy="3397250"/>
             <wp:docPr id="2" name="Picture 2"/>
             <wp:cNvGraphicFramePr>
               <a:graphicFrameLocks noChangeAspect="1"/>
@@ -1502,7 +737,7 @@
                   <pic:spPr>
                     <a:xfrm>
                       <a:off x="0" y="0"/>
-                      <a:ext cx="4069080" cy="4998751"/>
+                      <a:ext cx="4892040" cy="3397250"/>
                     </a:xfrm>
                     <a:prstGeom prst="rect"/>
                   </pic:spPr>
@@ -1515,16 +750,16 @@
     </w:p>
     <w:p>
       <w:pPr>
-        <w:spacing w:after="160"/>
         <w:jc w:val="center"/>
       </w:pPr>
       <w:r>
         <w:rPr>
           <w:rFonts w:ascii="Microsoft YaHei" w:hAnsi="Microsoft YaHei" w:eastAsia="Microsoft YaHei"/>
+          <w:b w:val="0"/>
           <w:color w:val="637083"/>
-          <w:sz w:val="18"/>
+          <w:sz w:val="17"/>
         </w:rPr>
-        <w:t>图 2 CRUD 管理测试截图</w:t>
+        <w:t>图 2 补全后的 CRUD 筛选分页页面</w:t>
       </w:r>
     </w:p>
     <w:p>
@@ -1532,20 +767,7 @@
         <w:pStyle w:val="Heading1"/>
       </w:pPr>
       <w:r>
-        <w:t>5. AI 辅助开发说明</w:t>
-      </w:r>
-    </w:p>
-    <w:p>
-      <w:r>
-        <w:t>开发过程中使用 AI 辅助拆解任务书、生成文档框架、检查接口覆盖和整理测试说明。项目代码、页面交互和文档内容均围绕课程任务书与当前本地项目实现进行调整，未把 API 密钥等敏感信息写入源码。</w:t>
-      </w:r>
-    </w:p>
-    <w:p>
-      <w:pPr>
-        <w:pStyle w:val="Heading1"/>
-      </w:pPr>
-      <w:r>
-        <w:t>6. 后续改进</w:t>
+        <w:t>4. 后续可选项</w:t>
       </w:r>
     </w:p>
     <w:p>
@@ -1555,10 +777,11 @@
       <w:r>
         <w:rPr>
           <w:rFonts w:ascii="Microsoft YaHei" w:hAnsi="Microsoft YaHei" w:eastAsia="Microsoft YaHei"/>
+          <w:b w:val="0"/>
           <w:color w:val="172033"/>
           <w:sz w:val="20"/>
         </w:rPr>
-        <w:t>• 增加按月份、关键词和金额区间筛选账目。</w:t>
+        <w:t>• 录制课程演示视频。</w:t>
       </w:r>
     </w:p>
     <w:p>
@@ -1568,10 +791,11 @@
       <w:r>
         <w:rPr>
           <w:rFonts w:ascii="Microsoft YaHei" w:hAnsi="Microsoft YaHei" w:eastAsia="Microsoft YaHei"/>
+          <w:b w:val="0"/>
           <w:color w:val="172033"/>
           <w:sz w:val="20"/>
         </w:rPr>
-        <w:t>• 补充更多图表，如月度趋势、预算使用率和收入来源分布。</w:t>
+        <w:t>• 生产部署时增加 WSGI、HTTPS、日志文件和备份策略。</w:t>
       </w:r>
     </w:p>
     <w:p>
@@ -1581,28 +805,16 @@
       <w:r>
         <w:rPr>
           <w:rFonts w:ascii="Microsoft YaHei" w:hAnsi="Microsoft YaHei" w:eastAsia="Microsoft YaHei"/>
+          <w:b w:val="0"/>
           <w:color w:val="172033"/>
           <w:sz w:val="20"/>
         </w:rPr>
-        <w:t>• 给心愿基金增加新增、编辑、归档能力。</w:t>
-      </w:r>
-    </w:p>
-    <w:p>
-      <w:pPr>
-        <w:ind w:left="259" w:hanging="173"/>
-      </w:pPr>
-      <w:r>
-        <w:rPr>
-          <w:rFonts w:ascii="Microsoft YaHei" w:hAnsi="Microsoft YaHei" w:eastAsia="Microsoft YaHei"/>
-          <w:color w:val="172033"/>
-          <w:sz w:val="20"/>
-        </w:rPr>
-        <w:t>• 录制演示视频，按游客浏览、登录、CRUD、AI 建议顺序展示。</w:t>
+        <w:t>• 可扩展心愿基金新增/编辑、CSV 导出和预算预警。</w:t>
       </w:r>
     </w:p>
     <w:sectPr>
       <w:pgSz w:w="12240" w:h="15840"/>
-      <w:pgMar w:top="1037" w:right="1123" w:bottom="1037" w:left="1123" w:header="720" w:footer="720" w:gutter="0"/>
+      <w:pgMar w:top="1037" w:right="1094" w:bottom="1037" w:left="1094" w:header="720" w:footer="720" w:gutter="0"/>
       <w:cols w:space="720"/>
       <w:docGrid w:linePitch="360"/>
     </w:sectPr>
@@ -1979,7 +1191,7 @@
     <w:rPr>
       <w:rFonts w:ascii="Microsoft YaHei" w:hAnsi="Microsoft YaHei" w:eastAsia="Microsoft YaHei"/>
       <w:color w:val="172033"/>
-      <w:sz w:val="21"/>
+      <w:sz w:val="20"/>
     </w:rPr>
   </w:style>
   <w:style w:type="paragraph" w:styleId="Header">
@@ -2037,7 +1249,7 @@
     <w:pPr>
       <w:keepNext/>
       <w:keepLines/>
-      <w:spacing w:before="320" w:after="160"/>
+      <w:spacing w:before="480" w:after="0"/>
       <w:outlineLvl w:val="0"/>
     </w:pPr>
     <w:rPr>
@@ -2045,7 +1257,7 @@
       <w:b/>
       <w:bCs/>
       <w:color w:val="1D4ED8"/>
-      <w:sz w:val="34"/>
+      <w:sz w:val="32"/>
       <w:szCs w:val="28"/>
     </w:rPr>
   </w:style>
@@ -2061,7 +1273,7 @@
     <w:pPr>
       <w:keepNext/>
       <w:keepLines/>
-      <w:spacing w:before="200" w:after="100"/>
+      <w:spacing w:before="200" w:after="0"/>
       <w:outlineLvl w:val="1"/>
     </w:pPr>
     <w:rPr>
@@ -2069,7 +1281,7 @@
       <w:b/>
       <w:bCs/>
       <w:color w:val="172033"/>
-      <w:sz w:val="26"/>
+      <w:sz w:val="24"/>
       <w:szCs w:val="26"/>
     </w:rPr>
   </w:style>
@@ -2089,11 +1301,10 @@
       <w:outlineLvl w:val="2"/>
     </w:pPr>
     <w:rPr>
-      <w:rFonts w:asciiTheme="majorHAnsi" w:eastAsiaTheme="majorEastAsia" w:hAnsiTheme="majorHAnsi" w:cstheme="majorBidi" w:ascii="Microsoft YaHei" w:hAnsi="Microsoft YaHei" w:eastAsia="Microsoft YaHei"/>
+      <w:rFonts w:asciiTheme="majorHAnsi" w:eastAsiaTheme="majorEastAsia" w:hAnsiTheme="majorHAnsi" w:cstheme="majorBidi"/>
       <w:b/>
       <w:bCs/>
-      <w:color w:val="172033"/>
-      <w:sz w:val="23"/>
+      <w:color w:val="4F81BD" w:themeColor="accent1"/>
     </w:rPr>
   </w:style>
   <w:style w:type="paragraph" w:styleId="Heading4">
@@ -2336,7 +1547,7 @@
       <w:color w:val="172033"/>
       <w:spacing w:val="5"/>
       <w:kern w:val="28"/>
-      <w:sz w:val="52"/>
+      <w:sz w:val="50"/>
       <w:szCs w:val="52"/>
     </w:rPr>
   </w:style>

</xml_diff>

<commit_message>
docs: polish submission documents
</commit_message>
<xml_diff>
--- a/星芒账本_开发总结.docx
+++ b/星芒账本_开发总结.docx
@@ -1,78 +1,83 @@
 
 <file path=word/document.xml><?xml version="1.0" encoding="utf-8"?>
-<w:document xmlns:wpc="http://schemas.microsoft.com/office/word/2010/wordprocessingCanvas" xmlns:mo="http://schemas.microsoft.com/office/mac/office/2008/main" xmlns:mc="http://schemas.openxmlformats.org/markup-compatibility/2006" xmlns:mv="urn:schemas-microsoft-com:mac:vml" xmlns:o="urn:schemas-microsoft-com:office:office" xmlns:r="http://schemas.openxmlformats.org/officeDocument/2006/relationships" xmlns:m="http://schemas.openxmlformats.org/officeDocument/2006/math" xmlns:v="urn:schemas-microsoft-com:vml" xmlns:wp14="http://schemas.microsoft.com/office/word/2010/wordprocessingDrawing" xmlns:wp="http://schemas.openxmlformats.org/drawingml/2006/wordprocessingDrawing" xmlns:w10="urn:schemas-microsoft-com:office:word" xmlns:w="http://schemas.openxmlformats.org/wordprocessingml/2006/main" xmlns:w14="http://schemas.microsoft.com/office/word/2010/wordml" xmlns:wpg="http://schemas.microsoft.com/office/word/2010/wordprocessingGroup" xmlns:wpi="http://schemas.microsoft.com/office/word/2010/wordprocessingInk" xmlns:wne="http://schemas.microsoft.com/office/word/2006/wordml" xmlns:wps="http://schemas.microsoft.com/office/word/2010/wordprocessingShape" mc:Ignorable="w14 wp14">
+<w:document xmlns:ns1="http://schemas.openxmlformats.org/markup-compatibility/2006" xmlns:ns2="http://schemas.openxmlformats.org/drawingml/2006/wordprocessingDrawing" xmlns:ns3="http://schemas.openxmlformats.org/drawingml/2006/main" xmlns:ns4="http://schemas.openxmlformats.org/drawingml/2006/picture" xmlns:ns5="http://schemas.openxmlformats.org/officeDocument/2006/relationships" xmlns:w="http://schemas.openxmlformats.org/wordprocessingml/2006/main" ns1:Ignorable="w14 wp14">
   <w:body>
-    <w:p/>
     <w:p>
       <w:pPr>
+        <w:spacing w:before="1000" w:after="360"/>
         <w:jc w:val="center"/>
       </w:pPr>
       <w:r>
         <w:rPr>
           <w:rFonts w:ascii="Microsoft YaHei" w:hAnsi="Microsoft YaHei" w:eastAsia="Microsoft YaHei"/>
           <w:b/>
-          <w:color w:val="172033"/>
-          <w:sz w:val="54"/>
+          <w:color w:val="192337"/>
+          <w:sz w:val="60"/>
         </w:rPr>
-        <w:t>星芒账本开发总结（功能补全版）</w:t>
+        <w:t>星芒账本开发总结</w:t>
       </w:r>
     </w:p>
     <w:p>
       <w:pPr>
+        <w:spacing w:after="640"/>
         <w:jc w:val="center"/>
       </w:pPr>
       <w:r>
         <w:rPr>
           <w:rFonts w:ascii="Microsoft YaHei" w:hAnsi="Microsoft YaHei" w:eastAsia="Microsoft YaHei"/>
-          <w:b w:val="0"/>
-          <w:color w:val="637083"/>
-          <w:sz w:val="24"/>
+          <w:color w:val="5C6C84"/>
+          <w:sz w:val="30"/>
         </w:rPr>
-        <w:t>课程设计开发复盘 · 前后端功能已补齐</w:t>
+        <w:t>创意型大学生生活记账本 · 课程设计开发总结</w:t>
       </w:r>
     </w:p>
-    <w:p/>
     <w:tbl>
       <w:tblPr>
         <w:tblStyle w:val="TableGrid"/>
         <w:tblW w:type="auto" w:w="0"/>
         <w:jc w:val="center"/>
+        <w:tblLayout w:type="fixed"/>
         <w:tblLook w:firstColumn="1" w:firstRow="1" w:lastColumn="0" w:lastRow="0" w:noHBand="0" w:noVBand="1" w:val="04A0"/>
         <w:tblBorders>
-          <w:top w:val="single" w:sz="6" w:space="0" w:color="D9E1EC"/>
-          <w:left w:val="single" w:sz="6" w:space="0" w:color="D9E1EC"/>
-          <w:bottom w:val="single" w:sz="6" w:space="0" w:color="D9E1EC"/>
-          <w:right w:val="single" w:sz="6" w:space="0" w:color="D9E1EC"/>
-          <w:insideH w:val="single" w:sz="6" w:space="0" w:color="D9E1EC"/>
-          <w:insideV w:val="single" w:sz="6" w:space="0" w:color="D9E1EC"/>
+          <w:top w:val="single" w:sz="8" w:space="0" w:color="D6E0EE"/>
+          <w:left w:val="single" w:sz="8" w:space="0" w:color="D6E0EE"/>
+          <w:bottom w:val="single" w:sz="8" w:space="0" w:color="D6E0EE"/>
+          <w:right w:val="single" w:sz="8" w:space="0" w:color="D6E0EE"/>
+          <w:insideH w:val="single" w:sz="8" w:space="0" w:color="D6E0EE"/>
+          <w:insideV w:val="single" w:sz="8" w:space="0" w:color="D6E0EE"/>
         </w:tblBorders>
       </w:tblPr>
       <w:tblGrid>
-        <w:gridCol w:w="5026"/>
-        <w:gridCol w:w="5026"/>
+        <w:gridCol w:w="5083"/>
+        <w:gridCol w:w="5083"/>
       </w:tblGrid>
       <w:tr>
         <w:trPr>
-          <w:tblHeader w:val="true"/>
+          <w:tblHeader/>
+          <w:cantSplit/>
         </w:trPr>
         <w:tc>
           <w:tcPr>
-            <w:tcW w:type="dxa" w:w="1944"/>
+            <w:tcW w:type="dxa" w:w="4032"/>
             <w:shd w:fill="EAF1FF"/>
+            <w:tcMar>
+              <w:top w:w="120" w:type="dxa"/>
+              <w:start w:w="140" w:type="dxa"/>
+              <w:bottom w:w="120" w:type="dxa"/>
+              <w:end w:w="140" w:type="dxa"/>
+            </w:tcMar>
             <w:vAlign w:val="center"/>
           </w:tcPr>
           <w:p>
             <w:pPr>
-              <w:spacing w:after="0" w:line="269" w:lineRule="auto"/>
               <w:jc w:val="center"/>
             </w:pPr>
-            <w:r/>
             <w:r>
               <w:rPr>
                 <w:rFonts w:ascii="Microsoft YaHei" w:hAnsi="Microsoft YaHei" w:eastAsia="Microsoft YaHei"/>
                 <w:b/>
-                <w:color w:val="1D4ED8"/>
-                <w:sz w:val="17"/>
+                <w:color w:val="1E54DC"/>
+                <w:sz w:val="21"/>
               </w:rPr>
               <w:t>项目项</w:t>
             </w:r>
@@ -80,22 +85,26 @@
         </w:tc>
         <w:tc>
           <w:tcPr>
-            <w:tcW w:type="dxa" w:w="7488"/>
+            <w:tcW w:type="dxa" w:w="5616"/>
             <w:shd w:fill="EAF1FF"/>
+            <w:tcMar>
+              <w:top w:w="120" w:type="dxa"/>
+              <w:start w:w="140" w:type="dxa"/>
+              <w:bottom w:w="120" w:type="dxa"/>
+              <w:end w:w="140" w:type="dxa"/>
+            </w:tcMar>
             <w:vAlign w:val="center"/>
           </w:tcPr>
           <w:p>
             <w:pPr>
-              <w:spacing w:after="0" w:line="269" w:lineRule="auto"/>
               <w:jc w:val="center"/>
             </w:pPr>
-            <w:r/>
             <w:r>
               <w:rPr>
                 <w:rFonts w:ascii="Microsoft YaHei" w:hAnsi="Microsoft YaHei" w:eastAsia="Microsoft YaHei"/>
                 <w:b/>
-                <w:color w:val="1D4ED8"/>
-                <w:sz w:val="17"/>
+                <w:color w:val="1E54DC"/>
+                <w:sz w:val="21"/>
               </w:rPr>
               <w:t>内容</w:t>
             </w:r>
@@ -103,183 +112,191 @@
         </w:tc>
       </w:tr>
       <w:tr>
+        <w:trPr>
+          <w:cantSplit/>
+        </w:trPr>
         <w:tc>
           <w:tcPr>
-            <w:tcW w:type="dxa" w:w="1944"/>
+            <w:tcW w:type="dxa" w:w="4032"/>
+            <w:tcMar>
+              <w:top w:w="120" w:type="dxa"/>
+              <w:start w:w="140" w:type="dxa"/>
+              <w:bottom w:w="120" w:type="dxa"/>
+              <w:end w:w="140" w:type="dxa"/>
+            </w:tcMar>
             <w:vAlign w:val="center"/>
           </w:tcPr>
           <w:p>
             <w:pPr>
-              <w:spacing w:after="0" w:line="269" w:lineRule="auto"/>
+              <w:spacing w:after="0" w:line="288" w:lineRule="auto"/>
             </w:pPr>
-            <w:r/>
             <w:r>
-              <w:rPr>
-                <w:rFonts w:ascii="Microsoft YaHei" w:hAnsi="Microsoft YaHei" w:eastAsia="Microsoft YaHei"/>
-                <w:b w:val="0"/>
-                <w:color w:val="172033"/>
-                <w:sz w:val="17"/>
-              </w:rPr>
               <w:t>项目名称</w:t>
             </w:r>
           </w:p>
         </w:tc>
         <w:tc>
           <w:tcPr>
-            <w:tcW w:type="dxa" w:w="7488"/>
+            <w:tcW w:type="dxa" w:w="5616"/>
+            <w:tcMar>
+              <w:top w:w="120" w:type="dxa"/>
+              <w:start w:w="140" w:type="dxa"/>
+              <w:bottom w:w="120" w:type="dxa"/>
+              <w:end w:w="140" w:type="dxa"/>
+            </w:tcMar>
             <w:vAlign w:val="center"/>
           </w:tcPr>
           <w:p>
             <w:pPr>
-              <w:spacing w:after="0" w:line="269" w:lineRule="auto"/>
+              <w:spacing w:after="0" w:line="288" w:lineRule="auto"/>
             </w:pPr>
-            <w:r/>
             <w:r>
-              <w:rPr>
-                <w:rFonts w:ascii="Microsoft YaHei" w:hAnsi="Microsoft YaHei" w:eastAsia="Microsoft YaHei"/>
-                <w:b w:val="0"/>
-                <w:color w:val="172033"/>
-                <w:sz w:val="17"/>
-              </w:rPr>
               <w:t>星芒账本</w:t>
             </w:r>
           </w:p>
         </w:tc>
       </w:tr>
       <w:tr>
+        <w:trPr>
+          <w:cantSplit/>
+        </w:trPr>
         <w:tc>
           <w:tcPr>
-            <w:tcW w:type="dxa" w:w="1944"/>
+            <w:tcW w:type="dxa" w:w="4032"/>
+            <w:tcMar>
+              <w:top w:w="120" w:type="dxa"/>
+              <w:start w:w="140" w:type="dxa"/>
+              <w:bottom w:w="120" w:type="dxa"/>
+              <w:end w:w="140" w:type="dxa"/>
+            </w:tcMar>
             <w:vAlign w:val="center"/>
           </w:tcPr>
           <w:p>
             <w:pPr>
-              <w:spacing w:after="0" w:line="269" w:lineRule="auto"/>
+              <w:spacing w:after="0" w:line="288" w:lineRule="auto"/>
             </w:pPr>
-            <w:r/>
             <w:r>
-              <w:rPr>
-                <w:rFonts w:ascii="Microsoft YaHei" w:hAnsi="Microsoft YaHei" w:eastAsia="Microsoft YaHei"/>
-                <w:b w:val="0"/>
-                <w:color w:val="172033"/>
-                <w:sz w:val="17"/>
-              </w:rPr>
-              <w:t>测试账号</w:t>
+              <w:t>开发范围</w:t>
             </w:r>
           </w:p>
         </w:tc>
         <w:tc>
           <w:tcPr>
-            <w:tcW w:type="dxa" w:w="7488"/>
+            <w:tcW w:type="dxa" w:w="5616"/>
+            <w:tcMar>
+              <w:top w:w="120" w:type="dxa"/>
+              <w:start w:w="140" w:type="dxa"/>
+              <w:bottom w:w="120" w:type="dxa"/>
+              <w:end w:w="140" w:type="dxa"/>
+            </w:tcMar>
             <w:vAlign w:val="center"/>
           </w:tcPr>
           <w:p>
             <w:pPr>
-              <w:spacing w:after="0" w:line="269" w:lineRule="auto"/>
+              <w:spacing w:after="0" w:line="288" w:lineRule="auto"/>
             </w:pPr>
-            <w:r/>
             <w:r>
-              <w:rPr>
-                <w:rFonts w:ascii="Microsoft YaHei" w:hAnsi="Microsoft YaHei" w:eastAsia="Microsoft YaHei"/>
-                <w:b w:val="0"/>
-                <w:color w:val="172033"/>
-                <w:sz w:val="17"/>
-              </w:rPr>
+              <w:t>前端页面、Flask 后端、SQLite 数据库、AI 教练、测试、截图和文档</w:t>
+            </w:r>
+          </w:p>
+        </w:tc>
+      </w:tr>
+      <w:tr>
+        <w:trPr>
+          <w:cantSplit/>
+        </w:trPr>
+        <w:tc>
+          <w:tcPr>
+            <w:tcW w:type="dxa" w:w="4032"/>
+            <w:tcMar>
+              <w:top w:w="120" w:type="dxa"/>
+              <w:start w:w="140" w:type="dxa"/>
+              <w:bottom w:w="120" w:type="dxa"/>
+              <w:end w:w="140" w:type="dxa"/>
+            </w:tcMar>
+            <w:vAlign w:val="center"/>
+          </w:tcPr>
+          <w:p>
+            <w:pPr>
+              <w:spacing w:after="0" w:line="288" w:lineRule="auto"/>
+            </w:pPr>
+            <w:r>
+              <w:t>演示账号</w:t>
+            </w:r>
+          </w:p>
+        </w:tc>
+        <w:tc>
+          <w:tcPr>
+            <w:tcW w:type="dxa" w:w="5616"/>
+            <w:tcMar>
+              <w:top w:w="120" w:type="dxa"/>
+              <w:start w:w="140" w:type="dxa"/>
+              <w:bottom w:w="120" w:type="dxa"/>
+              <w:end w:w="140" w:type="dxa"/>
+            </w:tcMar>
+            <w:vAlign w:val="center"/>
+          </w:tcPr>
+          <w:p>
+            <w:pPr>
+              <w:spacing w:after="0" w:line="288" w:lineRule="auto"/>
+            </w:pPr>
+            <w:r>
               <w:t>test / 123456</w:t>
             </w:r>
           </w:p>
         </w:tc>
       </w:tr>
       <w:tr>
+        <w:trPr>
+          <w:cantSplit/>
+        </w:trPr>
         <w:tc>
           <w:tcPr>
-            <w:tcW w:type="dxa" w:w="1944"/>
+            <w:tcW w:type="dxa" w:w="4032"/>
+            <w:tcMar>
+              <w:top w:w="120" w:type="dxa"/>
+              <w:start w:w="140" w:type="dxa"/>
+              <w:bottom w:w="120" w:type="dxa"/>
+              <w:end w:w="140" w:type="dxa"/>
+            </w:tcMar>
             <w:vAlign w:val="center"/>
           </w:tcPr>
           <w:p>
             <w:pPr>
-              <w:spacing w:after="0" w:line="269" w:lineRule="auto"/>
+              <w:spacing w:after="0" w:line="288" w:lineRule="auto"/>
             </w:pPr>
-            <w:r/>
             <w:r>
-              <w:rPr>
-                <w:rFonts w:ascii="Microsoft YaHei" w:hAnsi="Microsoft YaHei" w:eastAsia="Microsoft YaHei"/>
-                <w:b w:val="0"/>
-                <w:color w:val="172033"/>
-                <w:sz w:val="17"/>
-              </w:rPr>
-              <w:t>补全范围</w:t>
-            </w:r>
-          </w:p>
-        </w:tc>
-        <w:tc>
-          <w:tcPr>
-            <w:tcW w:type="dxa" w:w="7488"/>
-            <w:vAlign w:val="center"/>
-          </w:tcPr>
-          <w:p>
-            <w:pPr>
-              <w:spacing w:after="0" w:line="269" w:lineRule="auto"/>
-            </w:pPr>
-            <w:r/>
-            <w:r>
-              <w:rPr>
-                <w:rFonts w:ascii="Microsoft YaHei" w:hAnsi="Microsoft YaHei" w:eastAsia="Microsoft YaHei"/>
-                <w:b w:val="0"/>
-                <w:color w:val="172033"/>
-                <w:sz w:val="17"/>
-              </w:rPr>
-              <w:t>分页、月份过滤、错误日志、移动端输入、趋势图、预算图、文档与截图</w:t>
-            </w:r>
-          </w:p>
-        </w:tc>
-      </w:tr>
-      <w:tr>
-        <w:tc>
-          <w:tcPr>
-            <w:tcW w:type="dxa" w:w="1944"/>
-            <w:vAlign w:val="center"/>
-          </w:tcPr>
-          <w:p>
-            <w:pPr>
-              <w:spacing w:after="0" w:line="269" w:lineRule="auto"/>
-            </w:pPr>
-            <w:r/>
-            <w:r>
-              <w:rPr>
-                <w:rFonts w:ascii="Microsoft YaHei" w:hAnsi="Microsoft YaHei" w:eastAsia="Microsoft YaHei"/>
-                <w:b w:val="0"/>
-                <w:color w:val="172033"/>
-                <w:sz w:val="17"/>
-              </w:rPr>
               <w:t>完成日期</w:t>
             </w:r>
           </w:p>
         </w:tc>
         <w:tc>
           <w:tcPr>
-            <w:tcW w:type="dxa" w:w="7488"/>
+            <w:tcW w:type="dxa" w:w="5616"/>
+            <w:tcMar>
+              <w:top w:w="120" w:type="dxa"/>
+              <w:start w:w="140" w:type="dxa"/>
+              <w:bottom w:w="120" w:type="dxa"/>
+              <w:end w:w="140" w:type="dxa"/>
+            </w:tcMar>
             <w:vAlign w:val="center"/>
           </w:tcPr>
           <w:p>
             <w:pPr>
-              <w:spacing w:after="0" w:line="269" w:lineRule="auto"/>
+              <w:spacing w:after="0" w:line="288" w:lineRule="auto"/>
             </w:pPr>
-            <w:r/>
             <w:r>
-              <w:rPr>
-                <w:rFonts w:ascii="Microsoft YaHei" w:hAnsi="Microsoft YaHei" w:eastAsia="Microsoft YaHei"/>
-                <w:b w:val="0"/>
-                <w:color w:val="172033"/>
-                <w:sz w:val="17"/>
-              </w:rPr>
-              <w:t>2026-05-12</w:t>
+              <w:t>2026-05-13</w:t>
             </w:r>
           </w:p>
         </w:tc>
       </w:tr>
     </w:tbl>
-    <w:p/>
+    <w:p>
+      <w:pPr>
+        <w:spacing w:after="80"/>
+      </w:pPr>
+    </w:p>
     <w:p>
       <w:r>
         <w:br w:type="page"/>
@@ -295,58 +312,47 @@
     </w:p>
     <w:p>
       <w:pPr>
-        <w:ind w:left="259" w:hanging="173"/>
+        <w:spacing w:after="100"/>
+        <w:ind w:left="259" w:hanging="259"/>
       </w:pPr>
       <w:r>
-        <w:rPr>
-          <w:rFonts w:ascii="Microsoft YaHei" w:hAnsi="Microsoft YaHei" w:eastAsia="Microsoft YaHei"/>
-          <w:b w:val="0"/>
-          <w:color w:val="172033"/>
-          <w:sz w:val="20"/>
-        </w:rPr>
-        <w:t>• 完成 6 个前端视图和 13 个 Flask REST 接口。</w:t>
+        <w:t>- 完成游客浏览、登录注册、生活仪表盘、记账管理、心愿基金、AI 账本教练 6 个前端视图。</w:t>
       </w:r>
     </w:p>
     <w:p>
       <w:pPr>
-        <w:ind w:left="259" w:hanging="173"/>
+        <w:spacing w:after="100"/>
+        <w:ind w:left="259" w:hanging="259"/>
       </w:pPr>
       <w:r>
-        <w:rPr>
-          <w:rFonts w:ascii="Microsoft YaHei" w:hAnsi="Microsoft YaHei" w:eastAsia="Microsoft YaHei"/>
-          <w:b w:val="0"/>
-          <w:color w:val="172033"/>
-          <w:sz w:val="20"/>
-        </w:rPr>
-        <w:t>• 完成 users、categories、ledger_entries、saving_goals 4 张表，且每表不少于 10 条数据。</w:t>
+        <w:t>- 完成公开、认证、汇总、账目、目标、AI 和健康检查等 Flask REST 接口，统一返回 code、msg、data。</w:t>
       </w:r>
     </w:p>
     <w:p>
       <w:pPr>
-        <w:ind w:left="259" w:hanging="173"/>
+        <w:spacing w:after="100"/>
+        <w:ind w:left="259" w:hanging="259"/>
       </w:pPr>
       <w:r>
-        <w:rPr>
-          <w:rFonts w:ascii="Microsoft YaHei" w:hAnsi="Microsoft YaHei" w:eastAsia="Microsoft YaHei"/>
-          <w:b w:val="0"/>
-          <w:color w:val="172033"/>
-          <w:sz w:val="20"/>
-        </w:rPr>
-        <w:t>• 补齐分页、月份过滤、图表复盘、移动端输入优化和 API 统一错误处理。</w:t>
+        <w:t>- 完成 users、categories、ledger_entries、saving_goals 4 张数据表，自动写入不少于 10 条演示数据。</w:t>
       </w:r>
     </w:p>
     <w:p>
       <w:pPr>
-        <w:ind w:left="259" w:hanging="173"/>
+        <w:spacing w:after="100"/>
+        <w:ind w:left="259" w:hanging="259"/>
       </w:pPr>
       <w:r>
-        <w:rPr>
-          <w:rFonts w:ascii="Microsoft YaHei" w:hAnsi="Microsoft YaHei" w:eastAsia="Microsoft YaHei"/>
-          <w:b w:val="0"/>
-          <w:color w:val="172033"/>
-          <w:sz w:val="20"/>
-        </w:rPr>
-        <w:t>• 完成 DashScope 国内 AI 接口封装，密钥不写入源码。</w:t>
+        <w:t>- 完成月份过滤、分类筛选、类型筛选、分页、六个月趋势图、预算使用率图和移动端输入优化。</w:t>
+      </w:r>
+    </w:p>
+    <w:p>
+      <w:pPr>
+        <w:spacing w:after="100"/>
+        <w:ind w:left="259" w:hanging="259"/>
+      </w:pPr>
+      <w:r>
+        <w:t>- 完成 DashScope 国内 AI 接口封装，密钥不写入源码，演示环境可在无密钥时稳定运行。</w:t>
       </w:r>
     </w:p>
     <w:p>
@@ -354,7 +360,7 @@
         <w:pStyle w:val="Heading1"/>
       </w:pPr>
       <w:r>
-        <w:t>2. 补全记录</w:t>
+        <w:t>2. 工程结构</w:t>
       </w:r>
     </w:p>
     <w:tbl>
@@ -362,404 +368,417 @@
         <w:tblStyle w:val="TableGrid"/>
         <w:tblW w:type="auto" w:w="0"/>
         <w:jc w:val="center"/>
+        <w:tblLayout w:type="fixed"/>
         <w:tblLook w:firstColumn="1" w:firstRow="1" w:lastColumn="0" w:lastRow="0" w:noHBand="0" w:noVBand="1" w:val="04A0"/>
         <w:tblBorders>
-          <w:top w:val="single" w:sz="6" w:space="0" w:color="D9E1EC"/>
-          <w:left w:val="single" w:sz="6" w:space="0" w:color="D9E1EC"/>
-          <w:bottom w:val="single" w:sz="6" w:space="0" w:color="D9E1EC"/>
-          <w:right w:val="single" w:sz="6" w:space="0" w:color="D9E1EC"/>
-          <w:insideH w:val="single" w:sz="6" w:space="0" w:color="D9E1EC"/>
-          <w:insideV w:val="single" w:sz="6" w:space="0" w:color="D9E1EC"/>
+          <w:top w:val="single" w:sz="8" w:space="0" w:color="D6E0EE"/>
+          <w:left w:val="single" w:sz="8" w:space="0" w:color="D6E0EE"/>
+          <w:bottom w:val="single" w:sz="8" w:space="0" w:color="D6E0EE"/>
+          <w:right w:val="single" w:sz="8" w:space="0" w:color="D6E0EE"/>
+          <w:insideH w:val="single" w:sz="8" w:space="0" w:color="D6E0EE"/>
+          <w:insideV w:val="single" w:sz="8" w:space="0" w:color="D6E0EE"/>
         </w:tblBorders>
       </w:tblPr>
       <w:tblGrid>
-        <w:gridCol w:w="3351"/>
-        <w:gridCol w:w="3351"/>
-        <w:gridCol w:w="3351"/>
+        <w:gridCol w:w="3389"/>
+        <w:gridCol w:w="3389"/>
+        <w:gridCol w:w="3389"/>
       </w:tblGrid>
       <w:tr>
         <w:trPr>
-          <w:tblHeader w:val="true"/>
+          <w:tblHeader/>
+          <w:cantSplit/>
         </w:trPr>
         <w:tc>
           <w:tcPr>
-            <w:tcW w:type="dxa" w:w="1584"/>
+            <w:tcW w:type="dxa" w:w="2016"/>
             <w:shd w:fill="EAF1FF"/>
+            <w:tcMar>
+              <w:top w:w="120" w:type="dxa"/>
+              <w:start w:w="140" w:type="dxa"/>
+              <w:bottom w:w="120" w:type="dxa"/>
+              <w:end w:w="140" w:type="dxa"/>
+            </w:tcMar>
             <w:vAlign w:val="center"/>
           </w:tcPr>
           <w:p>
             <w:pPr>
-              <w:spacing w:after="0" w:line="269" w:lineRule="auto"/>
               <w:jc w:val="center"/>
             </w:pPr>
-            <w:r/>
             <w:r>
               <w:rPr>
                 <w:rFonts w:ascii="Microsoft YaHei" w:hAnsi="Microsoft YaHei" w:eastAsia="Microsoft YaHei"/>
                 <w:b/>
-                <w:color w:val="1D4ED8"/>
-                <w:sz w:val="17"/>
+                <w:color w:val="1E54DC"/>
+                <w:sz w:val="21"/>
               </w:rPr>
-              <w:t>类型</w:t>
+              <w:t>方向</w:t>
             </w:r>
           </w:p>
         </w:tc>
         <w:tc>
           <w:tcPr>
-            <w:tcW w:type="dxa" w:w="5760"/>
+            <w:tcW w:type="dxa" w:w="4320"/>
             <w:shd w:fill="EAF1FF"/>
+            <w:tcMar>
+              <w:top w:w="120" w:type="dxa"/>
+              <w:start w:w="140" w:type="dxa"/>
+              <w:bottom w:w="120" w:type="dxa"/>
+              <w:end w:w="140" w:type="dxa"/>
+            </w:tcMar>
             <w:vAlign w:val="center"/>
           </w:tcPr>
           <w:p>
             <w:pPr>
-              <w:spacing w:after="0" w:line="269" w:lineRule="auto"/>
               <w:jc w:val="center"/>
             </w:pPr>
-            <w:r/>
             <w:r>
               <w:rPr>
                 <w:rFonts w:ascii="Microsoft YaHei" w:hAnsi="Microsoft YaHei" w:eastAsia="Microsoft YaHei"/>
                 <w:b/>
-                <w:color w:val="1D4ED8"/>
-                <w:sz w:val="17"/>
+                <w:color w:val="1E54DC"/>
+                <w:sz w:val="21"/>
               </w:rPr>
-              <w:t>补全内容</w:t>
+              <w:t>实现</w:t>
             </w:r>
           </w:p>
         </w:tc>
         <w:tc>
           <w:tcPr>
-            <w:tcW w:type="dxa" w:w="2592"/>
+            <w:tcW w:type="dxa" w:w="3456"/>
             <w:shd w:fill="EAF1FF"/>
+            <w:tcMar>
+              <w:top w:w="120" w:type="dxa"/>
+              <w:start w:w="140" w:type="dxa"/>
+              <w:bottom w:w="120" w:type="dxa"/>
+              <w:end w:w="140" w:type="dxa"/>
+            </w:tcMar>
             <w:vAlign w:val="center"/>
           </w:tcPr>
           <w:p>
             <w:pPr>
-              <w:spacing w:after="0" w:line="269" w:lineRule="auto"/>
               <w:jc w:val="center"/>
             </w:pPr>
-            <w:r/>
             <w:r>
               <w:rPr>
                 <w:rFonts w:ascii="Microsoft YaHei" w:hAnsi="Microsoft YaHei" w:eastAsia="Microsoft YaHei"/>
                 <w:b/>
-                <w:color w:val="1D4ED8"/>
-                <w:sz w:val="17"/>
+                <w:color w:val="1E54DC"/>
+                <w:sz w:val="21"/>
               </w:rPr>
-              <w:t>验证</w:t>
+              <w:t>效果</w:t>
             </w:r>
           </w:p>
         </w:tc>
       </w:tr>
       <w:tr>
+        <w:trPr>
+          <w:cantSplit/>
+        </w:trPr>
         <w:tc>
           <w:tcPr>
-            <w:tcW w:type="dxa" w:w="1584"/>
+            <w:tcW w:type="dxa" w:w="2016"/>
+            <w:tcMar>
+              <w:top w:w="120" w:type="dxa"/>
+              <w:start w:w="140" w:type="dxa"/>
+              <w:bottom w:w="120" w:type="dxa"/>
+              <w:end w:w="140" w:type="dxa"/>
+            </w:tcMar>
             <w:vAlign w:val="center"/>
           </w:tcPr>
           <w:p>
             <w:pPr>
-              <w:spacing w:after="0" w:line="269" w:lineRule="auto"/>
+              <w:spacing w:after="0" w:line="288" w:lineRule="auto"/>
             </w:pPr>
-            <w:r/>
             <w:r>
-              <w:rPr>
-                <w:rFonts w:ascii="Microsoft YaHei" w:hAnsi="Microsoft YaHei" w:eastAsia="Microsoft YaHei"/>
-                <w:b w:val="0"/>
-                <w:color w:val="172033"/>
-                <w:sz w:val="17"/>
-              </w:rPr>
-              <w:t>后端</w:t>
+              <w:t>后端结构</w:t>
             </w:r>
           </w:p>
         </w:tc>
         <w:tc>
           <w:tcPr>
-            <w:tcW w:type="dxa" w:w="5760"/>
+            <w:tcW w:type="dxa" w:w="4320"/>
+            <w:tcMar>
+              <w:top w:w="120" w:type="dxa"/>
+              <w:start w:w="140" w:type="dxa"/>
+              <w:bottom w:w="120" w:type="dxa"/>
+              <w:end w:w="140" w:type="dxa"/>
+            </w:tcMar>
             <w:vAlign w:val="center"/>
           </w:tcPr>
           <w:p>
             <w:pPr>
-              <w:spacing w:after="0" w:line="269" w:lineRule="auto"/>
+              <w:spacing w:after="0" w:line="288" w:lineRule="auto"/>
             </w:pPr>
-            <w:r/>
             <w:r>
-              <w:rPr>
-                <w:rFonts w:ascii="Microsoft YaHei" w:hAnsi="Microsoft YaHei" w:eastAsia="Microsoft YaHei"/>
-                <w:b w:val="0"/>
-                <w:color w:val="172033"/>
-                <w:sz w:val="17"/>
-              </w:rPr>
-              <w:t>summary 月份过滤、entries 分页、非法参数 400、500 日志、JWT 环境变量。</w:t>
+              <w:t>应用工厂、配置层、扩展层、模型层、服务层、路由层、统一错误处理。</w:t>
             </w:r>
           </w:p>
         </w:tc>
         <w:tc>
           <w:tcPr>
-            <w:tcW w:type="dxa" w:w="2592"/>
+            <w:tcW w:type="dxa" w:w="3456"/>
+            <w:tcMar>
+              <w:top w:w="120" w:type="dxa"/>
+              <w:start w:w="140" w:type="dxa"/>
+              <w:bottom w:w="120" w:type="dxa"/>
+              <w:end w:w="140" w:type="dxa"/>
+            </w:tcMar>
             <w:vAlign w:val="center"/>
           </w:tcPr>
           <w:p>
             <w:pPr>
-              <w:spacing w:after="0" w:line="269" w:lineRule="auto"/>
+              <w:spacing w:after="0" w:line="288" w:lineRule="auto"/>
             </w:pPr>
-            <w:r/>
             <w:r>
-              <w:rPr>
-                <w:rFonts w:ascii="Microsoft YaHei" w:hAnsi="Microsoft YaHei" w:eastAsia="Microsoft YaHei"/>
-                <w:b w:val="0"/>
-                <w:color w:val="172033"/>
-                <w:sz w:val="17"/>
-              </w:rPr>
-              <w:t>接口测试通过。</w:t>
+              <w:t>降低路由复杂度，便于测试和部署。</w:t>
             </w:r>
           </w:p>
         </w:tc>
       </w:tr>
       <w:tr>
+        <w:trPr>
+          <w:cantSplit/>
+        </w:trPr>
         <w:tc>
           <w:tcPr>
-            <w:tcW w:type="dxa" w:w="1584"/>
+            <w:tcW w:type="dxa" w:w="2016"/>
+            <w:tcMar>
+              <w:top w:w="120" w:type="dxa"/>
+              <w:start w:w="140" w:type="dxa"/>
+              <w:bottom w:w="120" w:type="dxa"/>
+              <w:end w:w="140" w:type="dxa"/>
+            </w:tcMar>
             <w:vAlign w:val="center"/>
           </w:tcPr>
           <w:p>
             <w:pPr>
-              <w:spacing w:after="0" w:line="269" w:lineRule="auto"/>
+              <w:spacing w:after="0" w:line="288" w:lineRule="auto"/>
             </w:pPr>
-            <w:r/>
             <w:r>
-              <w:rPr>
-                <w:rFonts w:ascii="Microsoft YaHei" w:hAnsi="Microsoft YaHei" w:eastAsia="Microsoft YaHei"/>
-                <w:b w:val="0"/>
-                <w:color w:val="172033"/>
-                <w:sz w:val="17"/>
-              </w:rPr>
-              <w:t>前端</w:t>
+              <w:t>前端结构</w:t>
             </w:r>
           </w:p>
         </w:tc>
         <w:tc>
           <w:tcPr>
-            <w:tcW w:type="dxa" w:w="5760"/>
+            <w:tcW w:type="dxa" w:w="4320"/>
+            <w:tcMar>
+              <w:top w:w="120" w:type="dxa"/>
+              <w:start w:w="140" w:type="dxa"/>
+              <w:bottom w:w="120" w:type="dxa"/>
+              <w:end w:w="140" w:type="dxa"/>
+            </w:tcMar>
             <w:vAlign w:val="center"/>
           </w:tcPr>
           <w:p>
             <w:pPr>
-              <w:spacing w:after="0" w:line="269" w:lineRule="auto"/>
+              <w:spacing w:after="0" w:line="288" w:lineRule="auto"/>
             </w:pPr>
-            <w:r/>
             <w:r>
-              <w:rPr>
-                <w:rFonts w:ascii="Microsoft YaHei" w:hAnsi="Microsoft YaHei" w:eastAsia="Microsoft YaHei"/>
-                <w:b w:val="0"/>
-                <w:color w:val="172033"/>
-                <w:sz w:val="17"/>
-              </w:rPr>
-              <w:t>仪表盘月份控件、六个月趋势、预算使用率、账目筛选分页、移动端输入属性。</w:t>
+              <w:t>core 模块负责 API、状态、格式化、DOM；features 模块负责各业务视图。</w:t>
             </w:r>
           </w:p>
         </w:tc>
         <w:tc>
           <w:tcPr>
-            <w:tcW w:type="dxa" w:w="2592"/>
+            <w:tcW w:type="dxa" w:w="3456"/>
+            <w:tcMar>
+              <w:top w:w="120" w:type="dxa"/>
+              <w:start w:w="140" w:type="dxa"/>
+              <w:bottom w:w="120" w:type="dxa"/>
+              <w:end w:w="140" w:type="dxa"/>
+            </w:tcMar>
             <w:vAlign w:val="center"/>
           </w:tcPr>
           <w:p>
             <w:pPr>
-              <w:spacing w:after="0" w:line="269" w:lineRule="auto"/>
+              <w:spacing w:after="0" w:line="288" w:lineRule="auto"/>
             </w:pPr>
-            <w:r/>
             <w:r>
-              <w:rPr>
-                <w:rFonts w:ascii="Microsoft YaHei" w:hAnsi="Microsoft YaHei" w:eastAsia="Microsoft YaHei"/>
-                <w:b w:val="0"/>
-                <w:color w:val="172033"/>
-                <w:sz w:val="17"/>
-              </w:rPr>
-              <w:t>桌面和移动端浏览器验证通过。</w:t>
+              <w:t>页面逻辑更清晰，后续扩展成本更低。</w:t>
             </w:r>
           </w:p>
         </w:tc>
       </w:tr>
       <w:tr>
+        <w:trPr>
+          <w:cantSplit/>
+        </w:trPr>
         <w:tc>
           <w:tcPr>
-            <w:tcW w:type="dxa" w:w="1584"/>
+            <w:tcW w:type="dxa" w:w="2016"/>
+            <w:tcMar>
+              <w:top w:w="120" w:type="dxa"/>
+              <w:start w:w="140" w:type="dxa"/>
+              <w:bottom w:w="120" w:type="dxa"/>
+              <w:end w:w="140" w:type="dxa"/>
+            </w:tcMar>
             <w:vAlign w:val="center"/>
           </w:tcPr>
           <w:p>
             <w:pPr>
-              <w:spacing w:after="0" w:line="269" w:lineRule="auto"/>
+              <w:spacing w:after="0" w:line="288" w:lineRule="auto"/>
             </w:pPr>
-            <w:r/>
             <w:r>
-              <w:rPr>
-                <w:rFonts w:ascii="Microsoft YaHei" w:hAnsi="Microsoft YaHei" w:eastAsia="Microsoft YaHei"/>
-                <w:b w:val="0"/>
-                <w:color w:val="172033"/>
-                <w:sz w:val="17"/>
-              </w:rPr>
-              <w:t>材料</w:t>
+              <w:t>运行配置</w:t>
             </w:r>
           </w:p>
         </w:tc>
         <w:tc>
           <w:tcPr>
-            <w:tcW w:type="dxa" w:w="5760"/>
+            <w:tcW w:type="dxa" w:w="4320"/>
+            <w:tcMar>
+              <w:top w:w="120" w:type="dxa"/>
+              <w:start w:w="140" w:type="dxa"/>
+              <w:bottom w:w="120" w:type="dxa"/>
+              <w:end w:w="140" w:type="dxa"/>
+            </w:tcMar>
             <w:vAlign w:val="center"/>
           </w:tcPr>
           <w:p>
             <w:pPr>
-              <w:spacing w:after="0" w:line="269" w:lineRule="auto"/>
+              <w:spacing w:after="0" w:line="288" w:lineRule="auto"/>
             </w:pPr>
-            <w:r/>
             <w:r>
-              <w:rPr>
-                <w:rFonts w:ascii="Microsoft YaHei" w:hAnsi="Microsoft YaHei" w:eastAsia="Microsoft YaHei"/>
-                <w:b w:val="0"/>
-                <w:color w:val="172033"/>
-                <w:sz w:val="17"/>
-              </w:rPr>
-              <w:t>截图和文档更新为补全后的页面。</w:t>
+              <w:t>.env.example、wsgi.py、scripts/run_waitress.ps1。</w:t>
             </w:r>
           </w:p>
         </w:tc>
         <w:tc>
           <w:tcPr>
-            <w:tcW w:type="dxa" w:w="2592"/>
+            <w:tcW w:type="dxa" w:w="3456"/>
+            <w:tcMar>
+              <w:top w:w="120" w:type="dxa"/>
+              <w:start w:w="140" w:type="dxa"/>
+              <w:bottom w:w="120" w:type="dxa"/>
+              <w:end w:w="140" w:type="dxa"/>
+            </w:tcMar>
             <w:vAlign w:val="center"/>
           </w:tcPr>
           <w:p>
             <w:pPr>
-              <w:spacing w:after="0" w:line="269" w:lineRule="auto"/>
+              <w:spacing w:after="0" w:line="288" w:lineRule="auto"/>
             </w:pPr>
-            <w:r/>
             <w:r>
-              <w:rPr>
-                <w:rFonts w:ascii="Microsoft YaHei" w:hAnsi="Microsoft YaHei" w:eastAsia="Microsoft YaHei"/>
-                <w:b w:val="0"/>
-                <w:color w:val="172033"/>
-                <w:sz w:val="17"/>
-              </w:rPr>
-              <w:t>DOCX 渲染检查通过。</w:t>
+              <w:t>支持本地开发和生产演示两种启动方式。</w:t>
+            </w:r>
+          </w:p>
+        </w:tc>
+      </w:tr>
+      <w:tr>
+        <w:trPr>
+          <w:cantSplit/>
+        </w:trPr>
+        <w:tc>
+          <w:tcPr>
+            <w:tcW w:type="dxa" w:w="2016"/>
+            <w:tcMar>
+              <w:top w:w="120" w:type="dxa"/>
+              <w:start w:w="140" w:type="dxa"/>
+              <w:bottom w:w="120" w:type="dxa"/>
+              <w:end w:w="140" w:type="dxa"/>
+            </w:tcMar>
+            <w:vAlign w:val="center"/>
+          </w:tcPr>
+          <w:p>
+            <w:pPr>
+              <w:spacing w:after="0" w:line="288" w:lineRule="auto"/>
+            </w:pPr>
+            <w:r>
+              <w:t>质量保障</w:t>
+            </w:r>
+          </w:p>
+        </w:tc>
+        <w:tc>
+          <w:tcPr>
+            <w:tcW w:type="dxa" w:w="4320"/>
+            <w:tcMar>
+              <w:top w:w="120" w:type="dxa"/>
+              <w:start w:w="140" w:type="dxa"/>
+              <w:bottom w:w="120" w:type="dxa"/>
+              <w:end w:w="140" w:type="dxa"/>
+            </w:tcMar>
+            <w:vAlign w:val="center"/>
+          </w:tcPr>
+          <w:p>
+            <w:pPr>
+              <w:spacing w:after="0" w:line="288" w:lineRule="auto"/>
+            </w:pPr>
+            <w:r>
+              <w:t>pytest 接口测试、浏览器截图检查、移动端页面检查。</w:t>
+            </w:r>
+          </w:p>
+        </w:tc>
+        <w:tc>
+          <w:tcPr>
+            <w:tcW w:type="dxa" w:w="3456"/>
+            <w:tcMar>
+              <w:top w:w="120" w:type="dxa"/>
+              <w:start w:w="140" w:type="dxa"/>
+              <w:bottom w:w="120" w:type="dxa"/>
+              <w:end w:w="140" w:type="dxa"/>
+            </w:tcMar>
+            <w:vAlign w:val="center"/>
+          </w:tcPr>
+          <w:p>
+            <w:pPr>
+              <w:spacing w:after="0" w:line="288" w:lineRule="auto"/>
+            </w:pPr>
+            <w:r>
+              <w:t>确保代码、页面和文档均可交付。</w:t>
             </w:r>
           </w:p>
         </w:tc>
       </w:tr>
     </w:tbl>
-    <w:p/>
+    <w:p>
+      <w:pPr>
+        <w:spacing w:after="80"/>
+      </w:pPr>
+    </w:p>
     <w:p>
       <w:pPr>
         <w:pStyle w:val="Heading1"/>
       </w:pPr>
       <w:r>
-        <w:t>3. 截图证据</w:t>
+        <w:t>3. 测试摘要</w:t>
       </w:r>
     </w:p>
     <w:p>
       <w:pPr>
-        <w:jc w:val="center"/>
+        <w:spacing w:after="100"/>
+        <w:ind w:left="259" w:hanging="259"/>
       </w:pPr>
       <w:r>
-        <w:drawing>
-          <wp:inline xmlns:a="http://schemas.openxmlformats.org/drawingml/2006/main" xmlns:pic="http://schemas.openxmlformats.org/drawingml/2006/picture">
-            <wp:extent cx="5394960" cy="5035296"/>
-            <wp:docPr id="1" name="Picture 1"/>
-            <wp:cNvGraphicFramePr>
-              <a:graphicFrameLocks noChangeAspect="1"/>
-            </wp:cNvGraphicFramePr>
-            <a:graphic>
-              <a:graphicData uri="http://schemas.openxmlformats.org/drawingml/2006/picture">
-                <pic:pic>
-                  <pic:nvPicPr>
-                    <pic:cNvPr id="0" name="03_生活仪表盘.png"/>
-                    <pic:cNvPicPr/>
-                  </pic:nvPicPr>
-                  <pic:blipFill>
-                    <a:blip r:embed="rId9"/>
-                    <a:stretch>
-                      <a:fillRect/>
-                    </a:stretch>
-                  </pic:blipFill>
-                  <pic:spPr>
-                    <a:xfrm>
-                      <a:off x="0" y="0"/>
-                      <a:ext cx="5394960" cy="5035296"/>
-                    </a:xfrm>
-                    <a:prstGeom prst="rect"/>
-                  </pic:spPr>
-                </pic:pic>
-              </a:graphicData>
-            </a:graphic>
-          </wp:inline>
-        </w:drawing>
+        <w:t>- pytest 共 5 个测试用例通过，覆盖种子数据、公开接口、认证、月度汇总、分页、CRUD、非法参数和 AI 建议。</w:t>
       </w:r>
     </w:p>
     <w:p>
       <w:pPr>
-        <w:jc w:val="center"/>
+        <w:spacing w:after="100"/>
+        <w:ind w:left="259" w:hanging="259"/>
       </w:pPr>
       <w:r>
-        <w:rPr>
-          <w:rFonts w:ascii="Microsoft YaHei" w:hAnsi="Microsoft YaHei" w:eastAsia="Microsoft YaHei"/>
-          <w:b w:val="0"/>
-          <w:color w:val="637083"/>
-          <w:sz w:val="17"/>
-        </w:rPr>
-        <w:t>图 1 补全后的仪表盘</w:t>
+        <w:t>- 浏览器验证覆盖桌面端游客、认证、仪表盘、账目管理、心愿基金、AI 教练视图。</w:t>
       </w:r>
     </w:p>
     <w:p>
       <w:pPr>
-        <w:jc w:val="center"/>
+        <w:spacing w:after="100"/>
+        <w:ind w:left="259" w:hanging="259"/>
       </w:pPr>
       <w:r>
-        <w:drawing>
-          <wp:inline xmlns:a="http://schemas.openxmlformats.org/drawingml/2006/main" xmlns:pic="http://schemas.openxmlformats.org/drawingml/2006/picture">
-            <wp:extent cx="4892040" cy="3397250"/>
-            <wp:docPr id="2" name="Picture 2"/>
-            <wp:cNvGraphicFramePr>
-              <a:graphicFrameLocks noChangeAspect="1"/>
-            </wp:cNvGraphicFramePr>
-            <a:graphic>
-              <a:graphicData uri="http://schemas.openxmlformats.org/drawingml/2006/picture">
-                <pic:pic>
-                  <pic:nvPicPr>
-                    <pic:cNvPr id="0" name="04_记账管理.png"/>
-                    <pic:cNvPicPr/>
-                  </pic:nvPicPr>
-                  <pic:blipFill>
-                    <a:blip r:embed="rId10"/>
-                    <a:stretch>
-                      <a:fillRect/>
-                    </a:stretch>
-                  </pic:blipFill>
-                  <pic:spPr>
-                    <a:xfrm>
-                      <a:off x="0" y="0"/>
-                      <a:ext cx="4892040" cy="3397250"/>
-                    </a:xfrm>
-                    <a:prstGeom prst="rect"/>
-                  </pic:spPr>
-                </pic:pic>
-              </a:graphicData>
-            </a:graphic>
-          </wp:inline>
-        </w:drawing>
+        <w:t>- 移动端验证确认仪表盘无横向溢出。</w:t>
       </w:r>
     </w:p>
     <w:p>
       <w:pPr>
-        <w:jc w:val="center"/>
+        <w:spacing w:after="100"/>
+        <w:ind w:left="259" w:hanging="259"/>
       </w:pPr>
       <w:r>
-        <w:rPr>
-          <w:rFonts w:ascii="Microsoft YaHei" w:hAnsi="Microsoft YaHei" w:eastAsia="Microsoft YaHei"/>
-          <w:b w:val="0"/>
-          <w:color w:val="637083"/>
-          <w:sz w:val="17"/>
-        </w:rPr>
-        <w:t>图 2 补全后的 CRUD 筛选分页页面</w:t>
+        <w:t>- 项目说明文档、运行截图和数据库脚本完整纳入交付包。</w:t>
       </w:r>
     </w:p>
     <w:p>
@@ -767,54 +786,169 @@
         <w:pStyle w:val="Heading1"/>
       </w:pPr>
       <w:r>
-        <w:t>4. 后续可选项</w:t>
+        <w:t>4. 页面证据</w:t>
       </w:r>
     </w:p>
     <w:p>
       <w:pPr>
-        <w:ind w:left="259" w:hanging="173"/>
+        <w:keepNext/>
+        <w:jc w:val="center"/>
       </w:pPr>
       <w:r>
-        <w:rPr>
-          <w:rFonts w:ascii="Microsoft YaHei" w:hAnsi="Microsoft YaHei" w:eastAsia="Microsoft YaHei"/>
-          <w:b w:val="0"/>
-          <w:color w:val="172033"/>
-          <w:sz w:val="20"/>
-        </w:rPr>
-        <w:t>• 录制课程演示视频。</w:t>
+        <w:drawing>
+          <ns2:inline>
+            <ns2:extent cx="5440680" cy="5077968"/>
+            <ns2:docPr id="1" name="Picture 1"/>
+            <ns2:cNvGraphicFramePr>
+              <ns3:graphicFrameLocks noChangeAspect="1"/>
+            </ns2:cNvGraphicFramePr>
+            <ns3:graphic>
+              <ns3:graphicData uri="http://schemas.openxmlformats.org/drawingml/2006/picture">
+                <ns4:pic>
+                  <ns4:nvPicPr>
+                    <ns4:cNvPr id="0" name="03_生活仪表盘.png"/>
+                    <ns4:cNvPicPr/>
+                  </ns4:nvPicPr>
+                  <ns4:blipFill>
+                    <ns3:blip ns5:embed="rId9"/>
+                    <ns3:stretch>
+                      <ns3:fillRect/>
+                    </ns3:stretch>
+                  </ns4:blipFill>
+                  <ns4:spPr>
+                    <ns3:xfrm>
+                      <ns3:off x="0" y="0"/>
+                      <ns3:ext cx="5440680" cy="5077968"/>
+                    </ns3:xfrm>
+                    <ns3:prstGeom prst="rect"/>
+                  </ns4:spPr>
+                </ns4:pic>
+              </ns3:graphicData>
+            </ns3:graphic>
+          </ns2:inline>
+        </w:drawing>
       </w:r>
     </w:p>
     <w:p>
       <w:pPr>
-        <w:ind w:left="259" w:hanging="173"/>
+        <w:spacing w:after="200"/>
+        <w:jc w:val="center"/>
       </w:pPr>
       <w:r>
         <w:rPr>
-          <w:rFonts w:ascii="Microsoft YaHei" w:hAnsi="Microsoft YaHei" w:eastAsia="Microsoft YaHei"/>
-          <w:b w:val="0"/>
-          <w:color w:val="172033"/>
+          <w:color w:val="5C6C84"/>
           <w:sz w:val="20"/>
         </w:rPr>
-        <w:t>• 生产部署时增加 WSGI、HTTPS、日志文件和备份策略。</w:t>
+        <w:t>图 1 生活仪表盘</w:t>
+      </w:r>
+    </w:p>
+    <w:p>
+      <w:r/>
+    </w:p>
+    <w:p>
+      <w:pPr>
+        <w:keepNext/>
+        <w:jc w:val="center"/>
+      </w:pPr>
+      <w:r>
+        <w:drawing>
+          <ns2:inline>
+            <ns2:extent cx="5440680" cy="4299648"/>
+            <ns2:docPr id="2" name="Picture 2"/>
+            <ns2:cNvGraphicFramePr>
+              <ns3:graphicFrameLocks noChangeAspect="1"/>
+            </ns2:cNvGraphicFramePr>
+            <ns3:graphic>
+              <ns3:graphicData uri="http://schemas.openxmlformats.org/drawingml/2006/picture">
+                <ns4:pic>
+                  <ns4:nvPicPr>
+                    <ns4:cNvPr id="0" name="04_记账管理.png"/>
+                    <ns4:cNvPicPr/>
+                  </ns4:nvPicPr>
+                  <ns4:blipFill>
+                    <ns3:blip ns5:embed="rId10"/>
+                    <ns3:stretch>
+                      <ns3:fillRect/>
+                    </ns3:stretch>
+                  </ns4:blipFill>
+                  <ns4:spPr>
+                    <ns3:xfrm>
+                      <ns3:off x="0" y="0"/>
+                      <ns3:ext cx="5440680" cy="4299648"/>
+                    </ns3:xfrm>
+                    <ns3:prstGeom prst="rect"/>
+                  </ns4:spPr>
+                </ns4:pic>
+              </ns3:graphicData>
+            </ns3:graphic>
+          </ns2:inline>
+        </w:drawing>
       </w:r>
     </w:p>
     <w:p>
       <w:pPr>
-        <w:ind w:left="259" w:hanging="173"/>
+        <w:spacing w:after="200"/>
+        <w:jc w:val="center"/>
       </w:pPr>
       <w:r>
         <w:rPr>
-          <w:rFonts w:ascii="Microsoft YaHei" w:hAnsi="Microsoft YaHei" w:eastAsia="Microsoft YaHei"/>
-          <w:b w:val="0"/>
-          <w:color w:val="172033"/>
+          <w:color w:val="5C6C84"/>
           <w:sz w:val="20"/>
         </w:rPr>
-        <w:t>• 可扩展心愿基金新增/编辑、CSV 导出和预算预警。</w:t>
+        <w:t>图 2 记账管理</w:t>
+      </w:r>
+    </w:p>
+    <w:p>
+      <w:pPr>
+        <w:pStyle w:val="Heading1"/>
+      </w:pPr>
+      <w:r>
+        <w:t>5. 经验总结</w:t>
+      </w:r>
+    </w:p>
+    <w:p>
+      <w:r>
+        <w:t>本项目从大学生日常消费记录出发，把账目流水、预算复盘、目标储蓄和 AI 建议结合到一个完整 Web 应用中。开发过程中重点解决了接口边界、异常返回、月份过滤、分页、用户数据隔离和移动端体验等问题。</w:t>
+      </w:r>
+    </w:p>
+    <w:p>
+      <w:pPr>
+        <w:pStyle w:val="Heading1"/>
+      </w:pPr>
+      <w:r>
+        <w:t>6. 展望</w:t>
+      </w:r>
+    </w:p>
+    <w:p>
+      <w:pPr>
+        <w:spacing w:after="100"/>
+        <w:ind w:left="259" w:hanging="259"/>
+      </w:pPr>
+      <w:r>
+        <w:t>- 可增加账单导入、图表导出和预算提醒。</w:t>
+      </w:r>
+    </w:p>
+    <w:p>
+      <w:pPr>
+        <w:spacing w:after="100"/>
+        <w:ind w:left="259" w:hanging="259"/>
+      </w:pPr>
+      <w:r>
+        <w:t>- 可把 SQLite 切换为 MySQL 或 PostgreSQL，进一步支持多人长期使用。</w:t>
+      </w:r>
+    </w:p>
+    <w:p>
+      <w:pPr>
+        <w:spacing w:after="100"/>
+        <w:ind w:left="259" w:hanging="259"/>
+      </w:pPr>
+      <w:r>
+        <w:t>- 可接入真实大模型密钥，为不同用户生成更个性化的消费建议。</w:t>
       </w:r>
     </w:p>
     <w:sectPr>
       <w:pgSz w:w="12240" w:h="15840"/>
-      <w:pgMar w:top="1037" w:right="1094" w:bottom="1037" w:left="1094" w:header="720" w:footer="720" w:gutter="0"/>
+      <w:pgMar w:top="1080" w:right="1037" w:bottom="1008" w:left="1037" w:header="720" w:footer="720" w:gutter="0"/>
       <w:cols w:space="720"/>
       <w:docGrid w:linePitch="360"/>
     </w:sectPr>
@@ -1186,12 +1320,12 @@
     <w:qFormat/>
     <w:rsid w:val="00FC693F"/>
     <w:pPr>
-      <w:spacing w:line="283" w:lineRule="auto" w:after="100"/>
+      <w:spacing w:line="307" w:lineRule="auto" w:after="120"/>
     </w:pPr>
     <w:rPr>
       <w:rFonts w:ascii="Microsoft YaHei" w:hAnsi="Microsoft YaHei" w:eastAsia="Microsoft YaHei"/>
-      <w:color w:val="172033"/>
-      <w:sz w:val="20"/>
+      <w:color w:val="192337"/>
+      <w:sz w:val="22"/>
     </w:rPr>
   </w:style>
   <w:style w:type="paragraph" w:styleId="Header">
@@ -1249,15 +1383,15 @@
     <w:pPr>
       <w:keepNext/>
       <w:keepLines/>
-      <w:spacing w:before="480" w:after="0"/>
+      <w:spacing w:before="240" w:after="160"/>
       <w:outlineLvl w:val="0"/>
     </w:pPr>
     <w:rPr>
       <w:rFonts w:asciiTheme="majorHAnsi" w:eastAsiaTheme="majorEastAsia" w:hAnsiTheme="majorHAnsi" w:cstheme="majorBidi" w:ascii="Microsoft YaHei" w:hAnsi="Microsoft YaHei" w:eastAsia="Microsoft YaHei"/>
       <w:b/>
       <w:bCs/>
-      <w:color w:val="1D4ED8"/>
-      <w:sz w:val="32"/>
+      <w:color w:val="1E54DC"/>
+      <w:sz w:val="40"/>
       <w:szCs w:val="28"/>
     </w:rPr>
   </w:style>
@@ -1273,15 +1407,15 @@
     <w:pPr>
       <w:keepNext/>
       <w:keepLines/>
-      <w:spacing w:before="200" w:after="0"/>
+      <w:spacing w:before="240" w:after="160"/>
       <w:outlineLvl w:val="1"/>
     </w:pPr>
     <w:rPr>
       <w:rFonts w:asciiTheme="majorHAnsi" w:eastAsiaTheme="majorEastAsia" w:hAnsiTheme="majorHAnsi" w:cstheme="majorBidi" w:ascii="Microsoft YaHei" w:hAnsi="Microsoft YaHei" w:eastAsia="Microsoft YaHei"/>
       <w:b/>
       <w:bCs/>
-      <w:color w:val="172033"/>
-      <w:sz w:val="24"/>
+      <w:color w:val="1E54DC"/>
+      <w:sz w:val="30"/>
       <w:szCs w:val="26"/>
     </w:rPr>
   </w:style>
@@ -1297,14 +1431,15 @@
     <w:pPr>
       <w:keepNext/>
       <w:keepLines/>
-      <w:spacing w:before="200" w:after="0"/>
+      <w:spacing w:before="240" w:after="160"/>
       <w:outlineLvl w:val="2"/>
     </w:pPr>
     <w:rPr>
-      <w:rFonts w:asciiTheme="majorHAnsi" w:eastAsiaTheme="majorEastAsia" w:hAnsiTheme="majorHAnsi" w:cstheme="majorBidi"/>
+      <w:rFonts w:asciiTheme="majorHAnsi" w:eastAsiaTheme="majorEastAsia" w:hAnsiTheme="majorHAnsi" w:cstheme="majorBidi" w:ascii="Microsoft YaHei" w:hAnsi="Microsoft YaHei" w:eastAsia="Microsoft YaHei"/>
       <w:b/>
       <w:bCs/>
-      <w:color w:val="4F81BD" w:themeColor="accent1"/>
+      <w:color w:val="1E54DC"/>
+      <w:sz w:val="24"/>
     </w:rPr>
   </w:style>
   <w:style w:type="paragraph" w:styleId="Heading4">
@@ -1542,12 +1677,11 @@
       <w:contextualSpacing/>
     </w:pPr>
     <w:rPr>
-      <w:rFonts w:asciiTheme="majorHAnsi" w:eastAsiaTheme="majorEastAsia" w:hAnsiTheme="majorHAnsi" w:cstheme="majorBidi" w:ascii="Microsoft YaHei" w:hAnsi="Microsoft YaHei" w:eastAsia="Microsoft YaHei"/>
-      <w:b/>
-      <w:color w:val="172033"/>
+      <w:rFonts w:asciiTheme="majorHAnsi" w:eastAsiaTheme="majorEastAsia" w:hAnsiTheme="majorHAnsi" w:cstheme="majorBidi"/>
+      <w:color w:val="17365D" w:themeColor="text2" w:themeShade="BF"/>
       <w:spacing w:val="5"/>
       <w:kern w:val="28"/>
-      <w:sz w:val="50"/>
+      <w:sz w:val="52"/>
       <w:szCs w:val="52"/>
     </w:rPr>
   </w:style>

</xml_diff>

<commit_message>
chore: polish submission copy
</commit_message>
<xml_diff>
--- a/星芒账本_开发总结.docx
+++ b/星芒账本_开发总结.docx
@@ -221,7 +221,7 @@
               <w:spacing w:after="0" w:line="288" w:lineRule="auto"/>
             </w:pPr>
             <w:r>
-              <w:t>演示账号</w:t>
+              <w:t>登录方式</w:t>
             </w:r>
           </w:p>
         </w:tc>
@@ -241,7 +241,7 @@
               <w:spacing w:after="0" w:line="288" w:lineRule="auto"/>
             </w:pPr>
             <w:r>
-              <w:t>test / 123456</w:t>
+              <w:t>用户注册后登录使用</w:t>
             </w:r>
           </w:p>
         </w:tc>
@@ -352,7 +352,7 @@
         <w:ind w:left="259" w:hanging="259"/>
       </w:pPr>
       <w:r>
-        <w:t>- 完成 DashScope 国内 AI 接口封装，密钥不写入源码，演示环境可在无密钥时稳定运行。</w:t>
+        <w:t>- 完成智能账本建议模块，结合月度收支、分类排行和预算情况生成复盘建议。</w:t>
       </w:r>
     </w:p>
     <w:p>
@@ -706,7 +706,7 @@
               <w:spacing w:after="0" w:line="288" w:lineRule="auto"/>
             </w:pPr>
             <w:r>
-              <w:t>pytest 接口测试、浏览器截图检查、移动端页面检查。</w:t>
+              <w:t>接口测试、浏览器页面检查、移动端页面检查。</w:t>
             </w:r>
           </w:p>
         </w:tc>
@@ -742,7 +742,7 @@
         <w:pStyle w:val="Heading1"/>
       </w:pPr>
       <w:r>
-        <w:t>3. 测试摘要</w:t>
+        <w:t>3. 运行检查</w:t>
       </w:r>
     </w:p>
     <w:p>
@@ -751,7 +751,7 @@
         <w:ind w:left="259" w:hanging="259"/>
       </w:pPr>
       <w:r>
-        <w:t>- pytest 共 5 个测试用例通过，覆盖种子数据、公开接口、认证、月度汇总、分页、CRUD、非法参数和 AI 建议。</w:t>
+        <w:t>- 自动化测试通过，覆盖初始数据、公开接口、认证、月度汇总、分页、账目管理、非法参数和智能建议。</w:t>
       </w:r>
     </w:p>
     <w:p>
@@ -786,7 +786,7 @@
         <w:pStyle w:val="Heading1"/>
       </w:pPr>
       <w:r>
-        <w:t>4. 页面证据</w:t>
+        <w:t>4. 页面展示</w:t>
       </w:r>
     </w:p>
     <w:p>

</xml_diff>

<commit_message>
feat: expand ledger product features
</commit_message>
<xml_diff>
--- a/星芒账本_开发总结.docx
+++ b/星芒账本_开发总结.docx
@@ -316,7 +316,7 @@
         <w:ind w:left="259" w:hanging="259"/>
       </w:pPr>
       <w:r>
-        <w:t>- 完成游客浏览、登录注册、生活仪表盘、记账管理、心愿基金、AI 账本教练 6 个前端视图。</w:t>
+        <w:t>- 完成游客浏览、登录注册、个人资料、生活仪表盘、记账管理、心愿基金、交流社区、AI 账本教练 8 个前端视图。</w:t>
       </w:r>
     </w:p>
     <w:p>
@@ -343,7 +343,7 @@
         <w:ind w:left="259" w:hanging="259"/>
       </w:pPr>
       <w:r>
-        <w:t>- 完成月份过滤、分类筛选、类型筛选、分页、六个月趋势图、预算使用率图和移动端输入优化。</w:t>
+        <w:t>- 完成月份过滤、分类筛选、类型筛选、分页、分类/场景/心情管理、心愿基金流水、六个月趋势图、预算使用率图和移动端输入优化。</w:t>
       </w:r>
     </w:p>
     <w:p>
@@ -760,7 +760,7 @@
         <w:ind w:left="259" w:hanging="259"/>
       </w:pPr>
       <w:r>
-        <w:t>- 浏览器验证覆盖桌面端游客、认证、仪表盘、账目管理、心愿基金、AI 教练视图。</w:t>
+        <w:t>- 浏览器验证覆盖桌面端游客、认证、资料、仪表盘、账目管理、心愿基金、社区和 AI 教练视图。</w:t>
       </w:r>
     </w:p>
     <w:p>

</xml_diff>

<commit_message>
feat: redesign permission-based product flow
</commit_message>
<xml_diff>
--- a/星芒账本_开发总结.docx
+++ b/星芒账本_开发总结.docx
@@ -192,11 +192,8 @@
             <w:vAlign w:val="center"/>
           </w:tcPr>
           <w:p>
-            <w:pPr>
-              <w:spacing w:after="0" w:line="288" w:lineRule="auto"/>
-            </w:pPr>
             <w:r>
-              <w:t>前端页面、Flask 后端、SQLite 数据库、AI 教练、测试、截图和文档</w:t>
+              <w:t>前端页面、Flask 后端、SQLite 数据库、AI 教练、社区权限、测试、截图和文档</w:t>
             </w:r>
           </w:p>
         </w:tc>
@@ -237,11 +234,8 @@
             <w:vAlign w:val="center"/>
           </w:tcPr>
           <w:p>
-            <w:pPr>
-              <w:spacing w:after="0" w:line="288" w:lineRule="auto"/>
-            </w:pPr>
             <w:r>
-              <w:t>用户注册后登录使用</w:t>
+              <w:t>未登录可浏览公开内容，注册后登录使用</w:t>
             </w:r>
           </w:p>
         </w:tc>
@@ -316,7 +310,7 @@
         <w:ind w:left="259" w:hanging="259"/>
       </w:pPr>
       <w:r>
-        <w:t>- 完成游客浏览、登录注册、个人资料、生活仪表盘、记账管理、心愿基金、交流社区、AI 账本教练 8 个前端视图。</w:t>
+        <w:t>- 完成未登录仪表盘、登录注册、个人资料、生活仪表盘、记账管理、心愿基金、交流社区、AI 账本教练等前端视图；未登录状态不单独占用导航入口，而是在各功能页内体现权限。</w:t>
       </w:r>
     </w:p>
     <w:p>
@@ -325,7 +319,7 @@
         <w:ind w:left="259" w:hanging="259"/>
       </w:pPr>
       <w:r>
-        <w:t>- 完成公开、认证、汇总、账目、目标、AI 和健康检查等 Flask REST 接口，统一返回 code、msg、data。</w:t>
+        <w:t>- 完成公开、认证、个人资料、汇总、账目、分类、常用选项、目标、社区、AI 和健康检查等 Flask REST 接口，统一返回 code、msg、data。</w:t>
       </w:r>
     </w:p>
     <w:p>
@@ -334,7 +328,7 @@
         <w:ind w:left="259" w:hanging="259"/>
       </w:pPr>
       <w:r>
-        <w:t>- 完成 users、categories、ledger_entries、saving_goals 4 张数据表，自动写入不少于 10 条演示数据。</w:t>
+        <w:t>- 完成 users、categories、ledger_entries、entry_options、saving_goals、saving_goal_deposits、community_posts、community_comments 等数据表和初始数据。</w:t>
       </w:r>
     </w:p>
     <w:p>
@@ -343,7 +337,7 @@
         <w:ind w:left="259" w:hanging="259"/>
       </w:pPr>
       <w:r>
-        <w:t>- 完成月份过滤、分类筛选、类型筛选、分页、分类/场景/心情管理、心愿基金流水、六个月趋势图、预算使用率图和移动端输入优化。</w:t>
+        <w:t>- 完成月份过滤、分类筛选、类型筛选、分页、分类/场景/心情管理、心愿基金流水、社区只读权限、六个月趋势图、预算使用率图和移动端输入优化。</w:t>
       </w:r>
     </w:p>
     <w:p>
@@ -637,9 +631,6 @@
             <w:vAlign w:val="center"/>
           </w:tcPr>
           <w:p>
-            <w:pPr>
-              <w:spacing w:after="0" w:line="288" w:lineRule="auto"/>
-            </w:pPr>
             <w:r>
               <w:t>.env.example、wsgi.py、scripts/run_waitress.ps1。</w:t>
             </w:r>
@@ -657,11 +648,8 @@
             <w:vAlign w:val="center"/>
           </w:tcPr>
           <w:p>
-            <w:pPr>
-              <w:spacing w:after="0" w:line="288" w:lineRule="auto"/>
-            </w:pPr>
             <w:r>
-              <w:t>支持本地开发和生产演示两种启动方式。</w:t>
+              <w:t>支持本地开发和生产环境启动。</w:t>
             </w:r>
           </w:p>
         </w:tc>
@@ -760,7 +748,7 @@
         <w:ind w:left="259" w:hanging="259"/>
       </w:pPr>
       <w:r>
-        <w:t>- 浏览器验证覆盖桌面端游客、认证、资料、仪表盘、账目管理、心愿基金、社区和 AI 教练视图。</w:t>
+        <w:t>- 浏览器验证覆盖未登录仪表盘、认证、资料、仪表盘、账目管理、心愿基金、社区和 AI 教练视图。</w:t>
       </w:r>
     </w:p>
     <w:p>
@@ -908,7 +896,7 @@
     </w:p>
     <w:p>
       <w:r>
-        <w:t>本项目从大学生日常消费记录出发，把账目流水、预算复盘、目标储蓄和 AI 建议结合到一个完整 Web 应用中。开发过程中重点解决了接口边界、异常返回、月份过滤、分页、用户数据隔离和移动端体验等问题。</w:t>
+        <w:t>本项目从大学生日常消费记录出发，把账目流水、预算复盘、目标储蓄、公开社区和 AI 建议结合到一个完整 Web 应用中。开发过程中重点解决了接口边界、异常返回、权限状态、月份过滤、分页、用户数据隔离和移动端体验等问题。</w:t>
       </w:r>
     </w:p>
     <w:p>
@@ -943,7 +931,7 @@
         <w:ind w:left="259" w:hanging="259"/>
       </w:pPr>
       <w:r>
-        <w:t>- 可接入真实大模型密钥，为不同用户生成更个性化的消费建议。</w:t>
+        <w:t>- 可增强 AI 教练的长期复盘能力，为不同用户生成更个性化的消费建议。</w:t>
       </w:r>
     </w:p>
     <w:sectPr>

</xml_diff>